<commit_message>
Update mappings and template docx
</commit_message>
<xml_diff>
--- a/server/scripts/sequence-doc/src/version/DOD_20260828/sequenceWithTags.docx
+++ b/server/scripts/sequence-doc/src/version/DOD_20260828/sequenceWithTags.docx
@@ -4,15 +4,9 @@
   <w:body>
     <w:p>
       <w:pPr>
-        <w:spacing w:after="0" w:line="240" w:lineRule="auto"/>
-        <w:rPr>
-          <w:rFonts w:ascii="Times New Roman" w:hAnsi="Times New Roman" w:cs="Times New Roman"/>
-        </w:rPr>
-      </w:pPr>
-      <w:r>
-        <w:rPr>
-          <w:rFonts w:ascii="Times New Roman" w:hAnsi="Times New Roman" w:cs="Times New Roman"/>
-        </w:rPr>
+        <w:pStyle w:val="Heading3"/>
+      </w:pPr>
+      <w:r>
         <w:t xml:space="preserve">3.2.3 </w:t>
       </w:r>
       <w:r>
@@ -22,16 +16,9 @@
         <w:t>[EQUALS VAV CO]</w:t>
       </w:r>
       <w:r>
-        <w:rPr>
-          <w:rFonts w:ascii="Times New Roman" w:hAnsi="Times New Roman" w:cs="Times New Roman"/>
-          <w:color w:val="FF0000"/>
-        </w:rPr>
         <w:t xml:space="preserve"> </w:t>
       </w:r>
       <w:r>
-        <w:rPr>
-          <w:rFonts w:ascii="Times New Roman" w:hAnsi="Times New Roman" w:cs="Times New Roman"/>
-        </w:rPr>
         <w:t xml:space="preserve">VAV Box – Cooling-Only </w:t>
       </w:r>
     </w:p>
@@ -44,11 +31,15 @@
       </w:pPr>
       <w:r>
         <w:rPr>
-          <w:rFonts w:ascii="Times New Roman" w:hAnsi="Times New Roman" w:cs="Times New Roman"/>
           <w:noProof/>
         </w:rPr>
-        <w:pict w14:anchorId="3D8435FB">
-          <v:rect id="_x0000_i1030" alt="" style="width:468pt;height:.05pt;mso-width-percent:0;mso-height-percent:0;mso-width-percent:0;mso-height-percent:0" o:hralign="center" o:hrstd="t" o:hr="t" fillcolor="#a0a0a0" stroked="f"/>
+      </w:r>
+      <w:r>
+        <w:pict w14:anchorId="7EE14A30">
+          <v:rect id="Horizontal Line 1" o:spid="_x0000_s1031" style="width:468pt;height:.05pt;visibility:visible;mso-wrap-style:square;mso-left-percent:-10001;mso-top-percent:-10001;mso-position-horizontal:absolute;mso-position-horizontal-relative:char;mso-position-vertical:absolute;mso-position-vertical-relative:line;mso-left-percent:-10001;mso-top-percent:-10001;v-text-anchor:top" o:gfxdata="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" filled="f">
+            <o:lock v:ext="edit" rotation="t" aspectratio="t" verticies="t" text="t" shapetype="t"/>
+            <w10:anchorlock/>
+          </v:rect>
         </w:pict>
       </w:r>
     </w:p>
@@ -155,11 +146,15 @@
       </w:pPr>
       <w:r>
         <w:rPr>
-          <w:rFonts w:ascii="Times New Roman" w:hAnsi="Times New Roman" w:cs="Times New Roman"/>
           <w:noProof/>
         </w:rPr>
-        <w:pict w14:anchorId="46A49C62">
-          <v:rect id="_x0000_i1029" alt="" style="width:468pt;height:.05pt;mso-width-percent:0;mso-height-percent:0;mso-width-percent:0;mso-height-percent:0" o:hralign="center" o:hrstd="t" o:hr="t" fillcolor="#a0a0a0" stroked="f"/>
+      </w:r>
+      <w:r>
+        <w:pict w14:anchorId="68D65F81">
+          <v:rect id="Horizontal Line 2" o:spid="_x0000_s1030" style="width:468pt;height:.05pt;visibility:visible;mso-wrap-style:square;mso-left-percent:-10001;mso-top-percent:-10001;mso-position-horizontal:absolute;mso-position-horizontal-relative:char;mso-position-vertical:absolute;mso-position-vertical-relative:line;mso-left-percent:-10001;mso-top-percent:-10001;v-text-anchor:top" o:gfxdata="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" filled="f">
+            <o:lock v:ext="edit" rotation="t" aspectratio="t" verticies="t" text="t" shapetype="t"/>
+            <w10:anchorlock/>
+          </v:rect>
         </w:pict>
       </w:r>
     </w:p>
@@ -175,17 +170,118 @@
     </w:p>
     <w:p>
       <w:pPr>
+        <w:pStyle w:val="Heading4"/>
+      </w:pPr>
+      <w:r>
+        <w:t xml:space="preserve">3.2.3.1 Zone Temperature Control </w:t>
+      </w:r>
+    </w:p>
+    <w:p>
+      <w:pPr>
         <w:spacing w:after="0" w:line="240" w:lineRule="auto"/>
         <w:ind w:left="720"/>
         <w:rPr>
           <w:rFonts w:ascii="Times New Roman" w:hAnsi="Times New Roman" w:cs="Times New Roman"/>
         </w:rPr>
       </w:pPr>
-      <w:r>
-        <w:rPr>
-          <w:rFonts w:ascii="Times New Roman" w:hAnsi="Times New Roman" w:cs="Times New Roman"/>
-        </w:rPr>
-        <w:t xml:space="preserve">3.2.3.1 Zone Temperature Control </w:t>
+    </w:p>
+    <w:p>
+      <w:pPr>
+        <w:pStyle w:val="Heading5"/>
+      </w:pPr>
+      <w:r>
+        <w:t>3.2.3.1</w:t>
+      </w:r>
+      <w:r>
+        <w:t>.1</w:t>
+      </w:r>
+      <w:r>
+        <w:t xml:space="preserve"> Temperature Setpoint </w:t>
+      </w:r>
+    </w:p>
+    <w:p>
+      <w:pPr>
+        <w:spacing w:after="0" w:line="240" w:lineRule="auto"/>
+        <w:ind w:left="1440"/>
+        <w:rPr>
+          <w:rFonts w:ascii="Times New Roman" w:hAnsi="Times New Roman" w:cs="Times New Roman"/>
+        </w:rPr>
+      </w:pPr>
+    </w:p>
+    <w:p>
+      <w:pPr>
+        <w:spacing w:after="0" w:line="240" w:lineRule="auto"/>
+        <w:ind w:left="2160"/>
+        <w:rPr>
+          <w:rFonts w:ascii="Times New Roman" w:hAnsi="Times New Roman" w:cs="Times New Roman"/>
+        </w:rPr>
+      </w:pPr>
+      <w:r>
+        <w:rPr>
+          <w:rFonts w:ascii="Times New Roman" w:hAnsi="Times New Roman" w:cs="Times New Roman"/>
+        </w:rPr>
+        <w:t xml:space="preserve">Two temperature setpoints apply to the unit: 1) an occupied cooling setpoint equal to [78°F][___][as shown on the Point Schedule] (adj.) plus an adjustable offset from a zone thermostat, and 2) an unoccupied cooling setpoint [83°F][___][as shown on the Point Schedule] (adj.). </w:t>
+      </w:r>
+    </w:p>
+    <w:p>
+      <w:pPr>
+        <w:spacing w:after="0" w:line="240" w:lineRule="auto"/>
+        <w:rPr>
+          <w:rFonts w:ascii="Times New Roman" w:hAnsi="Times New Roman" w:cs="Times New Roman"/>
+        </w:rPr>
+      </w:pPr>
+    </w:p>
+    <w:p>
+      <w:pPr>
+        <w:pStyle w:val="Heading5"/>
+      </w:pPr>
+      <w:r>
+        <w:t>3.2.3.1</w:t>
+      </w:r>
+      <w:r>
+        <w:t>.2</w:t>
+      </w:r>
+      <w:r>
+        <w:t xml:space="preserve"> </w:t>
+      </w:r>
+      <w:r>
+        <w:rPr>
+          <w:rStyle w:val="Toggle"/>
+        </w:rPr>
+        <w:t>[YES NC]</w:t>
+      </w:r>
+      <w:r>
+        <w:rPr>
+          <w:color w:val="FF0000"/>
+        </w:rPr>
+        <w:t xml:space="preserve"> </w:t>
+      </w:r>
+      <w:r>
+        <w:t xml:space="preserve">‘Need Cool’ Request </w:t>
+      </w:r>
+    </w:p>
+    <w:p>
+      <w:pPr>
+        <w:spacing w:after="0" w:line="240" w:lineRule="auto"/>
+        <w:ind w:left="1440"/>
+        <w:rPr>
+          <w:rFonts w:ascii="Times New Roman" w:hAnsi="Times New Roman" w:cs="Times New Roman"/>
+        </w:rPr>
+      </w:pPr>
+    </w:p>
+    <w:p>
+      <w:pPr>
+        <w:spacing w:after="0" w:line="240" w:lineRule="auto"/>
+        <w:ind w:left="2160"/>
+        <w:rPr>
+          <w:rFonts w:ascii="Times New Roman" w:hAnsi="Times New Roman" w:cs="Times New Roman"/>
+        </w:rPr>
+      </w:pPr>
+      <w:r>
+        <w:rPr>
+          <w:rFonts w:ascii="Times New Roman" w:hAnsi="Times New Roman" w:cs="Times New Roman"/>
+        </w:rPr>
+        <w:t xml:space="preserve">As zone temperature rises above zone temperature setpoint, send a ‘need cool’ request. </w:t>
       </w:r>
     </w:p>
     <w:p>
@@ -199,29 +295,73 @@
     </w:p>
     <w:p>
       <w:pPr>
+        <w:pStyle w:val="Heading4"/>
+      </w:pPr>
+      <w:r>
+        <w:t xml:space="preserve">3.2.3.2 Zone Airflow Control </w:t>
+      </w:r>
+    </w:p>
+    <w:p>
+      <w:pPr>
+        <w:spacing w:after="0" w:line="240" w:lineRule="auto"/>
+        <w:ind w:left="720"/>
+        <w:rPr>
+          <w:rFonts w:ascii="Times New Roman" w:hAnsi="Times New Roman" w:cs="Times New Roman"/>
+        </w:rPr>
+      </w:pPr>
+    </w:p>
+    <w:p>
+      <w:pPr>
+        <w:pStyle w:val="Heading5"/>
+      </w:pPr>
+      <w:r>
+        <w:t xml:space="preserve">3.2.3.2.1 Airflow Setpoint </w:t>
+      </w:r>
+    </w:p>
+    <w:p>
+      <w:pPr>
         <w:spacing w:after="0" w:line="240" w:lineRule="auto"/>
         <w:ind w:left="1440"/>
         <w:rPr>
           <w:rFonts w:ascii="Times New Roman" w:hAnsi="Times New Roman" w:cs="Times New Roman"/>
         </w:rPr>
       </w:pPr>
-      <w:r>
-        <w:rPr>
-          <w:rFonts w:ascii="Times New Roman" w:hAnsi="Times New Roman" w:cs="Times New Roman"/>
-        </w:rPr>
-        <w:t>3.2.3.1</w:t>
-      </w:r>
-      <w:r>
-        <w:rPr>
-          <w:rFonts w:ascii="Times New Roman" w:hAnsi="Times New Roman" w:cs="Times New Roman"/>
-        </w:rPr>
-        <w:t>.1</w:t>
-      </w:r>
-      <w:r>
-        <w:rPr>
-          <w:rFonts w:ascii="Times New Roman" w:hAnsi="Times New Roman" w:cs="Times New Roman"/>
-        </w:rPr>
-        <w:t xml:space="preserve"> Temperature Setpoint </w:t>
+    </w:p>
+    <w:p>
+      <w:pPr>
+        <w:spacing w:after="0" w:line="240" w:lineRule="auto"/>
+        <w:ind w:left="2160"/>
+        <w:rPr>
+          <w:rFonts w:ascii="Times New Roman" w:hAnsi="Times New Roman" w:cs="Times New Roman"/>
+        </w:rPr>
+      </w:pPr>
+      <w:r>
+        <w:rPr>
+          <w:rFonts w:ascii="Times New Roman" w:hAnsi="Times New Roman" w:cs="Times New Roman"/>
+        </w:rPr>
+        <w:t xml:space="preserve">As zone temperature rises above zone temperature setpoint, increase airflow setpoint towards the maximum airflow value [___][as shown on the Point Schedule] (adj.). As zone temperature falls below the zone temperature setpoint, decrease airflow setpoint toward the minimum airflow value [___][as shown on the Point Schedule] (adj.). </w:t>
+      </w:r>
+    </w:p>
+    <w:p>
+      <w:pPr>
+        <w:spacing w:after="0" w:line="240" w:lineRule="auto"/>
+        <w:rPr>
+          <w:rFonts w:ascii="Times New Roman" w:hAnsi="Times New Roman" w:cs="Times New Roman"/>
+        </w:rPr>
+      </w:pPr>
+    </w:p>
+    <w:p>
+      <w:pPr>
+        <w:pStyle w:val="Heading5"/>
+      </w:pPr>
+      <w:r>
+        <w:t>3.2.3.2</w:t>
+      </w:r>
+      <w:r>
+        <w:t>.2</w:t>
+      </w:r>
+      <w:r>
+        <w:t xml:space="preserve"> Primary Air Damper </w:t>
       </w:r>
     </w:p>
     <w:p>
@@ -245,256 +385,37 @@
         <w:rPr>
           <w:rFonts w:ascii="Times New Roman" w:hAnsi="Times New Roman" w:cs="Times New Roman"/>
         </w:rPr>
-        <w:t xml:space="preserve">Two temperature setpoints apply to the unit: 1) an occupied cooling setpoint equal to [78°F][___][as shown on the Point Schedule] (adj.) plus an adjustable offset from a zone thermostat, and 2) an unoccupied cooling setpoint [83°F][___][as shown on the Point Schedule] (adj.). </w:t>
-      </w:r>
-    </w:p>
-    <w:p>
-      <w:pPr>
-        <w:spacing w:after="0" w:line="240" w:lineRule="auto"/>
-        <w:rPr>
-          <w:rFonts w:ascii="Times New Roman" w:hAnsi="Times New Roman" w:cs="Times New Roman"/>
-        </w:rPr>
-      </w:pPr>
-    </w:p>
-    <w:p>
-      <w:pPr>
-        <w:spacing w:after="0" w:line="240" w:lineRule="auto"/>
-        <w:ind w:left="1440"/>
-        <w:rPr>
-          <w:rFonts w:ascii="Times New Roman" w:hAnsi="Times New Roman" w:cs="Times New Roman"/>
-        </w:rPr>
-      </w:pPr>
-      <w:r>
-        <w:rPr>
-          <w:rFonts w:ascii="Times New Roman" w:hAnsi="Times New Roman" w:cs="Times New Roman"/>
-        </w:rPr>
-        <w:t>3.2.3.1</w:t>
-      </w:r>
-      <w:r>
-        <w:rPr>
-          <w:rFonts w:ascii="Times New Roman" w:hAnsi="Times New Roman" w:cs="Times New Roman"/>
-        </w:rPr>
-        <w:t>.2</w:t>
-      </w:r>
-      <w:r>
-        <w:rPr>
-          <w:rFonts w:ascii="Times New Roman" w:hAnsi="Times New Roman" w:cs="Times New Roman"/>
+        <w:t xml:space="preserve">Modulate the primary air damper to maintain the primary airflow at setpoint. </w:t>
+      </w:r>
+    </w:p>
+    <w:p>
+      <w:pPr>
+        <w:spacing w:after="0" w:line="240" w:lineRule="auto"/>
+        <w:rPr>
+          <w:rFonts w:ascii="Times New Roman" w:hAnsi="Times New Roman" w:cs="Times New Roman"/>
+        </w:rPr>
+      </w:pPr>
+    </w:p>
+    <w:p>
+      <w:pPr>
+        <w:pStyle w:val="Heading3"/>
+      </w:pPr>
+      <w:r>
+        <w:t xml:space="preserve">3.2.4 </w:t>
+      </w:r>
+      <w:r>
+        <w:rPr>
+          <w:rStyle w:val="Toggle"/>
+        </w:rPr>
+        <w:t>[EQUALS VAV RH]</w:t>
+      </w:r>
+      <w:r>
+        <w:rPr>
+          <w:color w:val="FF0000"/>
         </w:rPr>
         <w:t xml:space="preserve"> </w:t>
       </w:r>
       <w:r>
-        <w:rPr>
-          <w:rStyle w:val="Toggle"/>
-        </w:rPr>
-        <w:t>[YES NC]</w:t>
-      </w:r>
-      <w:r>
-        <w:rPr>
-          <w:rFonts w:ascii="Times New Roman" w:hAnsi="Times New Roman" w:cs="Times New Roman"/>
-          <w:color w:val="FF0000"/>
-        </w:rPr>
-        <w:t xml:space="preserve"> </w:t>
-      </w:r>
-      <w:r>
-        <w:rPr>
-          <w:rFonts w:ascii="Times New Roman" w:hAnsi="Times New Roman" w:cs="Times New Roman"/>
-        </w:rPr>
-        <w:t xml:space="preserve">‘Need Cool’ Request </w:t>
-      </w:r>
-    </w:p>
-    <w:p>
-      <w:pPr>
-        <w:spacing w:after="0" w:line="240" w:lineRule="auto"/>
-        <w:ind w:left="1440"/>
-        <w:rPr>
-          <w:rFonts w:ascii="Times New Roman" w:hAnsi="Times New Roman" w:cs="Times New Roman"/>
-        </w:rPr>
-      </w:pPr>
-    </w:p>
-    <w:p>
-      <w:pPr>
-        <w:spacing w:after="0" w:line="240" w:lineRule="auto"/>
-        <w:ind w:left="2160"/>
-        <w:rPr>
-          <w:rFonts w:ascii="Times New Roman" w:hAnsi="Times New Roman" w:cs="Times New Roman"/>
-        </w:rPr>
-      </w:pPr>
-      <w:r>
-        <w:rPr>
-          <w:rFonts w:ascii="Times New Roman" w:hAnsi="Times New Roman" w:cs="Times New Roman"/>
-        </w:rPr>
-        <w:t xml:space="preserve">As zone temperature rises above zone temperature setpoint, send a ‘need cool’ request. </w:t>
-      </w:r>
-    </w:p>
-    <w:p>
-      <w:pPr>
-        <w:spacing w:after="0" w:line="240" w:lineRule="auto"/>
-        <w:ind w:left="720"/>
-        <w:rPr>
-          <w:rFonts w:ascii="Times New Roman" w:hAnsi="Times New Roman" w:cs="Times New Roman"/>
-        </w:rPr>
-      </w:pPr>
-    </w:p>
-    <w:p>
-      <w:pPr>
-        <w:spacing w:after="0" w:line="240" w:lineRule="auto"/>
-        <w:ind w:left="720"/>
-        <w:rPr>
-          <w:rFonts w:ascii="Times New Roman" w:hAnsi="Times New Roman" w:cs="Times New Roman"/>
-        </w:rPr>
-      </w:pPr>
-      <w:r>
-        <w:rPr>
-          <w:rFonts w:ascii="Times New Roman" w:hAnsi="Times New Roman" w:cs="Times New Roman"/>
-        </w:rPr>
-        <w:t xml:space="preserve">3.2.3.2 Zone Airflow Control </w:t>
-      </w:r>
-    </w:p>
-    <w:p>
-      <w:pPr>
-        <w:spacing w:after="0" w:line="240" w:lineRule="auto"/>
-        <w:ind w:left="720"/>
-        <w:rPr>
-          <w:rFonts w:ascii="Times New Roman" w:hAnsi="Times New Roman" w:cs="Times New Roman"/>
-        </w:rPr>
-      </w:pPr>
-    </w:p>
-    <w:p>
-      <w:pPr>
-        <w:spacing w:after="0" w:line="240" w:lineRule="auto"/>
-        <w:ind w:left="1440"/>
-        <w:rPr>
-          <w:rFonts w:ascii="Times New Roman" w:hAnsi="Times New Roman" w:cs="Times New Roman"/>
-        </w:rPr>
-      </w:pPr>
-      <w:r>
-        <w:rPr>
-          <w:rFonts w:ascii="Times New Roman" w:hAnsi="Times New Roman" w:cs="Times New Roman"/>
-        </w:rPr>
-        <w:t xml:space="preserve">3.2.3.2.1 Airflow Setpoint </w:t>
-      </w:r>
-    </w:p>
-    <w:p>
-      <w:pPr>
-        <w:spacing w:after="0" w:line="240" w:lineRule="auto"/>
-        <w:ind w:left="1440"/>
-        <w:rPr>
-          <w:rFonts w:ascii="Times New Roman" w:hAnsi="Times New Roman" w:cs="Times New Roman"/>
-        </w:rPr>
-      </w:pPr>
-    </w:p>
-    <w:p>
-      <w:pPr>
-        <w:spacing w:after="0" w:line="240" w:lineRule="auto"/>
-        <w:ind w:left="2160"/>
-        <w:rPr>
-          <w:rFonts w:ascii="Times New Roman" w:hAnsi="Times New Roman" w:cs="Times New Roman"/>
-        </w:rPr>
-      </w:pPr>
-      <w:r>
-        <w:rPr>
-          <w:rFonts w:ascii="Times New Roman" w:hAnsi="Times New Roman" w:cs="Times New Roman"/>
-        </w:rPr>
-        <w:t xml:space="preserve">As zone temperature rises above zone temperature setpoint, increase airflow setpoint towards the maximum airflow value [___][as shown on the Point Schedule] (adj.). As zone temperature falls below the zone temperature setpoint, decrease airflow setpoint toward the minimum airflow value [___][as shown on the Point Schedule] (adj.). </w:t>
-      </w:r>
-    </w:p>
-    <w:p>
-      <w:pPr>
-        <w:spacing w:after="0" w:line="240" w:lineRule="auto"/>
-        <w:rPr>
-          <w:rFonts w:ascii="Times New Roman" w:hAnsi="Times New Roman" w:cs="Times New Roman"/>
-        </w:rPr>
-      </w:pPr>
-    </w:p>
-    <w:p>
-      <w:pPr>
-        <w:spacing w:after="0" w:line="240" w:lineRule="auto"/>
-        <w:ind w:left="1440"/>
-        <w:rPr>
-          <w:rFonts w:ascii="Times New Roman" w:hAnsi="Times New Roman" w:cs="Times New Roman"/>
-        </w:rPr>
-      </w:pPr>
-      <w:r>
-        <w:rPr>
-          <w:rFonts w:ascii="Times New Roman" w:hAnsi="Times New Roman" w:cs="Times New Roman"/>
-        </w:rPr>
-        <w:t>3.2.3.2</w:t>
-      </w:r>
-      <w:r>
-        <w:rPr>
-          <w:rFonts w:ascii="Times New Roman" w:hAnsi="Times New Roman" w:cs="Times New Roman"/>
-        </w:rPr>
-        <w:t>.2</w:t>
-      </w:r>
-      <w:r>
-        <w:rPr>
-          <w:rFonts w:ascii="Times New Roman" w:hAnsi="Times New Roman" w:cs="Times New Roman"/>
-        </w:rPr>
-        <w:t xml:space="preserve"> Primary Air Damper </w:t>
-      </w:r>
-    </w:p>
-    <w:p>
-      <w:pPr>
-        <w:spacing w:after="0" w:line="240" w:lineRule="auto"/>
-        <w:ind w:left="1440"/>
-        <w:rPr>
-          <w:rFonts w:ascii="Times New Roman" w:hAnsi="Times New Roman" w:cs="Times New Roman"/>
-        </w:rPr>
-      </w:pPr>
-    </w:p>
-    <w:p>
-      <w:pPr>
-        <w:spacing w:after="0" w:line="240" w:lineRule="auto"/>
-        <w:ind w:left="2160"/>
-        <w:rPr>
-          <w:rFonts w:ascii="Times New Roman" w:hAnsi="Times New Roman" w:cs="Times New Roman"/>
-        </w:rPr>
-      </w:pPr>
-      <w:r>
-        <w:rPr>
-          <w:rFonts w:ascii="Times New Roman" w:hAnsi="Times New Roman" w:cs="Times New Roman"/>
-        </w:rPr>
-        <w:t xml:space="preserve">Modulate the primary air damper to maintain the primary airflow at setpoint. </w:t>
-      </w:r>
-    </w:p>
-    <w:p>
-      <w:pPr>
-        <w:spacing w:after="0" w:line="240" w:lineRule="auto"/>
-        <w:rPr>
-          <w:rFonts w:ascii="Times New Roman" w:hAnsi="Times New Roman" w:cs="Times New Roman"/>
-        </w:rPr>
-      </w:pPr>
-    </w:p>
-    <w:p>
-      <w:pPr>
-        <w:spacing w:after="0" w:line="240" w:lineRule="auto"/>
-        <w:rPr>
-          <w:rFonts w:ascii="Times New Roman" w:hAnsi="Times New Roman" w:cs="Times New Roman"/>
-        </w:rPr>
-      </w:pPr>
-      <w:r>
-        <w:rPr>
-          <w:rFonts w:ascii="Times New Roman" w:hAnsi="Times New Roman" w:cs="Times New Roman"/>
-        </w:rPr>
-        <w:t xml:space="preserve">3.2.4 </w:t>
-      </w:r>
-      <w:r>
-        <w:rPr>
-          <w:rStyle w:val="Toggle"/>
-        </w:rPr>
-        <w:t>[EQUALS VAV RH]</w:t>
-      </w:r>
-      <w:r>
-        <w:rPr>
-          <w:rFonts w:ascii="Times New Roman" w:hAnsi="Times New Roman" w:cs="Times New Roman"/>
-          <w:color w:val="FF0000"/>
-        </w:rPr>
-        <w:t xml:space="preserve"> </w:t>
-      </w:r>
-      <w:r>
-        <w:rPr>
-          <w:rFonts w:ascii="Times New Roman" w:hAnsi="Times New Roman" w:cs="Times New Roman"/>
-        </w:rPr>
         <w:t xml:space="preserve">VAV Box with Reheat </w:t>
       </w:r>
     </w:p>
@@ -507,11 +428,15 @@
       </w:pPr>
       <w:r>
         <w:rPr>
-          <w:rFonts w:ascii="Times New Roman" w:hAnsi="Times New Roman" w:cs="Times New Roman"/>
           <w:noProof/>
         </w:rPr>
-        <w:pict w14:anchorId="414D3E4E">
-          <v:rect id="_x0000_i1028" alt="" style="width:468pt;height:.05pt;mso-width-percent:0;mso-height-percent:0;mso-width-percent:0;mso-height-percent:0" o:hralign="center" o:hrstd="t" o:hr="t" fillcolor="#a0a0a0" stroked="f"/>
+      </w:r>
+      <w:r>
+        <w:pict w14:anchorId="1EA56144">
+          <v:rect id="Horizontal Line 3" o:spid="_x0000_s1029" style="width:468pt;height:.05pt;visibility:visible;mso-wrap-style:square;mso-left-percent:-10001;mso-top-percent:-10001;mso-position-horizontal:absolute;mso-position-horizontal-relative:char;mso-position-vertical:absolute;mso-position-vertical-relative:line;mso-left-percent:-10001;mso-top-percent:-10001;v-text-anchor:top" o:gfxdata="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" filled="f">
+            <o:lock v:ext="edit" rotation="t" aspectratio="t" verticies="t" text="t" shapetype="t"/>
+            <w10:anchorlock/>
+          </v:rect>
         </w:pict>
       </w:r>
     </w:p>
@@ -670,11 +595,15 @@
       </w:pPr>
       <w:r>
         <w:rPr>
-          <w:rFonts w:ascii="Times New Roman" w:hAnsi="Times New Roman" w:cs="Times New Roman"/>
           <w:noProof/>
         </w:rPr>
-        <w:pict w14:anchorId="07DB1064">
-          <v:rect id="_x0000_i1027" alt="" style="width:468pt;height:.05pt;mso-width-percent:0;mso-height-percent:0;mso-width-percent:0;mso-height-percent:0" o:hralign="center" o:hrstd="t" o:hr="t" fillcolor="#a0a0a0" stroked="f"/>
+      </w:r>
+      <w:r>
+        <w:pict w14:anchorId="39690D71">
+          <v:rect id="Horizontal Line 4" o:spid="_x0000_s1028" style="width:468pt;height:.05pt;visibility:visible;mso-wrap-style:square;mso-left-percent:-10001;mso-top-percent:-10001;mso-position-horizontal:absolute;mso-position-horizontal-relative:char;mso-position-vertical:absolute;mso-position-vertical-relative:line;mso-left-percent:-10001;mso-top-percent:-10001;v-text-anchor:top" o:gfxdata="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" filled="f">
+            <o:lock v:ext="edit" rotation="t" aspectratio="t" verticies="t" text="t" shapetype="t"/>
+            <w10:anchorlock/>
+          </v:rect>
         </w:pict>
       </w:r>
     </w:p>
@@ -688,17 +617,183 @@
     </w:p>
     <w:p>
       <w:pPr>
+        <w:pStyle w:val="Heading4"/>
+      </w:pPr>
+      <w:r>
+        <w:t xml:space="preserve">3.2.4.1 Zone Temperature Control </w:t>
+      </w:r>
+    </w:p>
+    <w:p>
+      <w:pPr>
         <w:spacing w:after="0" w:line="240" w:lineRule="auto"/>
         <w:ind w:left="720"/>
         <w:rPr>
           <w:rFonts w:ascii="Times New Roman" w:hAnsi="Times New Roman" w:cs="Times New Roman"/>
         </w:rPr>
       </w:pPr>
-      <w:r>
-        <w:rPr>
-          <w:rFonts w:ascii="Times New Roman" w:hAnsi="Times New Roman" w:cs="Times New Roman"/>
-        </w:rPr>
-        <w:t xml:space="preserve">3.2.4.1 Zone Temperature Control </w:t>
+    </w:p>
+    <w:p>
+      <w:pPr>
+        <w:pStyle w:val="Heading5"/>
+      </w:pPr>
+      <w:r>
+        <w:t xml:space="preserve">3.2.4.1.1 Temperature Setpoint </w:t>
+      </w:r>
+    </w:p>
+    <w:p>
+      <w:pPr>
+        <w:spacing w:after="0" w:line="240" w:lineRule="auto"/>
+        <w:ind w:left="1440"/>
+        <w:rPr>
+          <w:rFonts w:ascii="Times New Roman" w:hAnsi="Times New Roman" w:cs="Times New Roman"/>
+        </w:rPr>
+      </w:pPr>
+    </w:p>
+    <w:p>
+      <w:pPr>
+        <w:spacing w:after="0" w:line="240" w:lineRule="auto"/>
+        <w:ind w:left="2160"/>
+        <w:rPr>
+          <w:rFonts w:ascii="Times New Roman" w:hAnsi="Times New Roman" w:cs="Times New Roman"/>
+        </w:rPr>
+      </w:pPr>
+      <w:r>
+        <w:rPr>
+          <w:rFonts w:ascii="Times New Roman" w:hAnsi="Times New Roman" w:cs="Times New Roman"/>
+        </w:rPr>
+        <w:t>Three independent temperature setpoints apply to the unit: 1) an occupied setpoint equal to [73</w:t>
+      </w:r>
+      <w:r>
+        <w:rPr>
+          <w:rFonts w:ascii="Times New Roman" w:hAnsi="Times New Roman" w:cs="Times New Roman"/>
+        </w:rPr>
+        <w:t>°F</w:t>
+      </w:r>
+      <w:r>
+        <w:rPr>
+          <w:rFonts w:ascii="Times New Roman" w:hAnsi="Times New Roman" w:cs="Times New Roman"/>
+        </w:rPr>
+        <w:t>][___][as shown on the Point Schedule] (adj.) plus an adjustable offset from a zone thermostat, 2) an unoccupied heating setpoint [63</w:t>
+      </w:r>
+      <w:r>
+        <w:rPr>
+          <w:rFonts w:ascii="Times New Roman" w:hAnsi="Times New Roman" w:cs="Times New Roman"/>
+        </w:rPr>
+        <w:t>°F</w:t>
+      </w:r>
+      <w:r>
+        <w:rPr>
+          <w:rFonts w:ascii="Times New Roman" w:hAnsi="Times New Roman" w:cs="Times New Roman"/>
+        </w:rPr>
+        <w:t>][___][as shown on the Point Schedule] (adj.), and 3) an unoccupied cooling setpoint [83</w:t>
+      </w:r>
+      <w:r>
+        <w:rPr>
+          <w:rFonts w:ascii="Times New Roman" w:hAnsi="Times New Roman" w:cs="Times New Roman"/>
+        </w:rPr>
+        <w:t>°F</w:t>
+      </w:r>
+      <w:r>
+        <w:rPr>
+          <w:rFonts w:ascii="Times New Roman" w:hAnsi="Times New Roman" w:cs="Times New Roman"/>
+        </w:rPr>
+        <w:t xml:space="preserve">][___][as shown on the Point Schedule] (adj.). The occupied heating and cooling setpoints are calculated as described below. </w:t>
+      </w:r>
+    </w:p>
+    <w:p>
+      <w:pPr>
+        <w:spacing w:after="0" w:line="240" w:lineRule="auto"/>
+        <w:ind w:left="2160"/>
+        <w:rPr>
+          <w:rFonts w:ascii="Times New Roman" w:hAnsi="Times New Roman" w:cs="Times New Roman"/>
+        </w:rPr>
+      </w:pPr>
+    </w:p>
+    <w:p>
+      <w:pPr>
+        <w:spacing w:after="0" w:line="240" w:lineRule="auto"/>
+        <w:ind w:left="2160"/>
+        <w:rPr>
+          <w:rFonts w:ascii="Times New Roman" w:hAnsi="Times New Roman" w:cs="Times New Roman"/>
+        </w:rPr>
+      </w:pPr>
+      <w:r>
+        <w:rPr>
+          <w:rFonts w:ascii="Times New Roman" w:hAnsi="Times New Roman" w:cs="Times New Roman"/>
+        </w:rPr>
+        <w:t>Occupied heating setpoint is equal to the occupied setpoint minus [5</w:t>
+      </w:r>
+      <w:r>
+        <w:rPr>
+          <w:rFonts w:ascii="Times New Roman" w:hAnsi="Times New Roman" w:cs="Times New Roman"/>
+        </w:rPr>
+        <w:t>°F</w:t>
+      </w:r>
+      <w:r>
+        <w:rPr>
+          <w:rFonts w:ascii="Times New Roman" w:hAnsi="Times New Roman" w:cs="Times New Roman"/>
+        </w:rPr>
+        <w:t xml:space="preserve">][___][as shown on the Point Schedule] (adj.) for heating. </w:t>
+      </w:r>
+    </w:p>
+    <w:p>
+      <w:pPr>
+        <w:spacing w:after="0" w:line="240" w:lineRule="auto"/>
+        <w:ind w:left="2160"/>
+        <w:rPr>
+          <w:rFonts w:ascii="Times New Roman" w:hAnsi="Times New Roman" w:cs="Times New Roman"/>
+        </w:rPr>
+      </w:pPr>
+    </w:p>
+    <w:p>
+      <w:pPr>
+        <w:spacing w:after="0" w:line="240" w:lineRule="auto"/>
+        <w:ind w:left="2160"/>
+        <w:rPr>
+          <w:rFonts w:ascii="Times New Roman" w:hAnsi="Times New Roman" w:cs="Times New Roman"/>
+        </w:rPr>
+      </w:pPr>
+      <w:r>
+        <w:rPr>
+          <w:rFonts w:ascii="Times New Roman" w:hAnsi="Times New Roman" w:cs="Times New Roman"/>
+        </w:rPr>
+        <w:t>Occupied cooling setpoint is equal to the occupied setpoint plus [5</w:t>
+      </w:r>
+      <w:r>
+        <w:rPr>
+          <w:rFonts w:ascii="Times New Roman" w:hAnsi="Times New Roman" w:cs="Times New Roman"/>
+        </w:rPr>
+        <w:t>°F</w:t>
+      </w:r>
+      <w:r>
+        <w:rPr>
+          <w:rFonts w:ascii="Times New Roman" w:hAnsi="Times New Roman" w:cs="Times New Roman"/>
+        </w:rPr>
+        <w:t xml:space="preserve">][___][as shown on the Point Schedule] (adj.) for cooling. </w:t>
+      </w:r>
+    </w:p>
+    <w:p>
+      <w:pPr>
+        <w:spacing w:after="0" w:line="240" w:lineRule="auto"/>
+        <w:ind w:left="2160"/>
+        <w:rPr>
+          <w:rFonts w:ascii="Times New Roman" w:hAnsi="Times New Roman" w:cs="Times New Roman"/>
+        </w:rPr>
+      </w:pPr>
+    </w:p>
+    <w:p>
+      <w:pPr>
+        <w:spacing w:after="0" w:line="240" w:lineRule="auto"/>
+        <w:ind w:left="2160"/>
+        <w:rPr>
+          <w:rFonts w:ascii="Times New Roman" w:hAnsi="Times New Roman" w:cs="Times New Roman"/>
+        </w:rPr>
+      </w:pPr>
+      <w:r>
+        <w:rPr>
+          <w:rFonts w:ascii="Times New Roman" w:hAnsi="Times New Roman" w:cs="Times New Roman"/>
+        </w:rPr>
+        <w:t xml:space="preserve">Enable cooling mode whenever the zone temperature is above the effective cooling setpoint. Enable heating mode whenever the zone temperature is below the effective heating setpoint. </w:t>
       </w:r>
     </w:p>
     <w:p>
@@ -712,17 +807,49 @@
     </w:p>
     <w:p>
       <w:pPr>
+        <w:pStyle w:val="Heading5"/>
+      </w:pPr>
+      <w:r>
+        <w:t xml:space="preserve">3.2.4.1.2 </w:t>
+      </w:r>
+      <w:r>
+        <w:rPr>
+          <w:rStyle w:val="Toggle"/>
+        </w:rPr>
+        <w:t>[YES NC]</w:t>
+      </w:r>
+      <w:r>
+        <w:rPr>
+          <w:color w:val="FF0000"/>
+        </w:rPr>
+        <w:t xml:space="preserve"> </w:t>
+      </w:r>
+      <w:r>
+        <w:t xml:space="preserve">‘Need Cool’ Request </w:t>
+      </w:r>
+    </w:p>
+    <w:p>
+      <w:pPr>
         <w:spacing w:after="0" w:line="240" w:lineRule="auto"/>
         <w:ind w:left="1440"/>
         <w:rPr>
           <w:rFonts w:ascii="Times New Roman" w:hAnsi="Times New Roman" w:cs="Times New Roman"/>
         </w:rPr>
       </w:pPr>
-      <w:r>
-        <w:rPr>
-          <w:rFonts w:ascii="Times New Roman" w:hAnsi="Times New Roman" w:cs="Times New Roman"/>
-        </w:rPr>
-        <w:t xml:space="preserve">3.2.4.1.1 Temperature Setpoint </w:t>
+    </w:p>
+    <w:p>
+      <w:pPr>
+        <w:spacing w:after="0" w:line="240" w:lineRule="auto"/>
+        <w:ind w:left="2160"/>
+        <w:rPr>
+          <w:rFonts w:ascii="Times New Roman" w:hAnsi="Times New Roman" w:cs="Times New Roman"/>
+        </w:rPr>
+      </w:pPr>
+      <w:r>
+        <w:rPr>
+          <w:rFonts w:ascii="Times New Roman" w:hAnsi="Times New Roman" w:cs="Times New Roman"/>
+        </w:rPr>
+        <w:t xml:space="preserve">If zone temperature is above the effective cooling setpoint, send a ‘need cool’ request. </w:t>
       </w:r>
     </w:p>
     <w:p>
@@ -736,6 +863,38 @@
     </w:p>
     <w:p>
       <w:pPr>
+        <w:pStyle w:val="Heading5"/>
+      </w:pPr>
+      <w:r>
+        <w:t xml:space="preserve">3.2.4.1.3 </w:t>
+      </w:r>
+      <w:r>
+        <w:rPr>
+          <w:rStyle w:val="Toggle"/>
+        </w:rPr>
+        <w:t>[YES NH]</w:t>
+      </w:r>
+      <w:r>
+        <w:rPr>
+          <w:color w:val="FF0000"/>
+        </w:rPr>
+        <w:t xml:space="preserve"> </w:t>
+      </w:r>
+      <w:r>
+        <w:t xml:space="preserve">‘Need Heat’ Request </w:t>
+      </w:r>
+    </w:p>
+    <w:p>
+      <w:pPr>
+        <w:spacing w:after="0" w:line="240" w:lineRule="auto"/>
+        <w:ind w:left="1440"/>
+        <w:rPr>
+          <w:rFonts w:ascii="Times New Roman" w:hAnsi="Times New Roman" w:cs="Times New Roman"/>
+        </w:rPr>
+      </w:pPr>
+    </w:p>
+    <w:p>
+      <w:pPr>
         <w:spacing w:after="0" w:line="240" w:lineRule="auto"/>
         <w:ind w:left="2160"/>
         <w:rPr>
@@ -746,44 +905,50 @@
         <w:rPr>
           <w:rFonts w:ascii="Times New Roman" w:hAnsi="Times New Roman" w:cs="Times New Roman"/>
         </w:rPr>
-        <w:t>Three independent temperature setpoints apply to the unit: 1) an occupied setpoint equal to [73</w:t>
-      </w:r>
-      <w:r>
-        <w:rPr>
-          <w:rFonts w:ascii="Times New Roman" w:hAnsi="Times New Roman" w:cs="Times New Roman"/>
-        </w:rPr>
-        <w:t>°F</w:t>
-      </w:r>
-      <w:r>
-        <w:rPr>
-          <w:rFonts w:ascii="Times New Roman" w:hAnsi="Times New Roman" w:cs="Times New Roman"/>
-        </w:rPr>
-        <w:t>][___][as shown on the Point Schedule] (adj.) plus an adjustable offset from a zone thermostat, 2) an unoccupied heating setpoint [63</w:t>
-      </w:r>
-      <w:r>
-        <w:rPr>
-          <w:rFonts w:ascii="Times New Roman" w:hAnsi="Times New Roman" w:cs="Times New Roman"/>
-        </w:rPr>
-        <w:t>°F</w:t>
-      </w:r>
-      <w:r>
-        <w:rPr>
-          <w:rFonts w:ascii="Times New Roman" w:hAnsi="Times New Roman" w:cs="Times New Roman"/>
-        </w:rPr>
-        <w:t>][___][as shown on the Point Schedule] (adj.), and 3) an unoccupied cooling setpoint [83</w:t>
-      </w:r>
-      <w:r>
-        <w:rPr>
-          <w:rFonts w:ascii="Times New Roman" w:hAnsi="Times New Roman" w:cs="Times New Roman"/>
-        </w:rPr>
-        <w:t>°F</w:t>
-      </w:r>
-      <w:r>
-        <w:rPr>
-          <w:rFonts w:ascii="Times New Roman" w:hAnsi="Times New Roman" w:cs="Times New Roman"/>
-        </w:rPr>
-        <w:t xml:space="preserve">][___][as shown on the Point Schedule] (adj.). The occupied heating and cooling setpoints are calculated as described below. </w:t>
-      </w:r>
+        <w:t xml:space="preserve">If zone temperature is above the effective heating setpoint, send a ‘need heat’ request. </w:t>
+      </w:r>
+    </w:p>
+    <w:p>
+      <w:pPr>
+        <w:spacing w:after="0" w:line="240" w:lineRule="auto"/>
+        <w:rPr>
+          <w:rFonts w:ascii="Times New Roman" w:hAnsi="Times New Roman" w:cs="Times New Roman"/>
+        </w:rPr>
+      </w:pPr>
+    </w:p>
+    <w:p>
+      <w:pPr>
+        <w:pStyle w:val="Heading4"/>
+      </w:pPr>
+      <w:r>
+        <w:t xml:space="preserve">3.2.4.2 Zone Airflow Control </w:t>
+      </w:r>
+    </w:p>
+    <w:p>
+      <w:pPr>
+        <w:spacing w:after="0" w:line="240" w:lineRule="auto"/>
+        <w:ind w:left="720"/>
+        <w:rPr>
+          <w:rFonts w:ascii="Times New Roman" w:hAnsi="Times New Roman" w:cs="Times New Roman"/>
+        </w:rPr>
+      </w:pPr>
+    </w:p>
+    <w:p>
+      <w:pPr>
+        <w:pStyle w:val="Heading5"/>
+      </w:pPr>
+      <w:r>
+        <w:t xml:space="preserve">3.2.4.2.1 Airflow Setpoint </w:t>
+      </w:r>
+    </w:p>
+    <w:p>
+      <w:pPr>
+        <w:spacing w:after="0" w:line="240" w:lineRule="auto"/>
+        <w:ind w:left="1440"/>
+        <w:rPr>
+          <w:rFonts w:ascii="Times New Roman" w:hAnsi="Times New Roman" w:cs="Times New Roman"/>
+        </w:rPr>
+      </w:pPr>
     </w:p>
     <w:p>
       <w:pPr>
@@ -793,6 +958,74 @@
           <w:rFonts w:ascii="Times New Roman" w:hAnsi="Times New Roman" w:cs="Times New Roman"/>
         </w:rPr>
       </w:pPr>
+      <w:r>
+        <w:rPr>
+          <w:rFonts w:ascii="Times New Roman" w:hAnsi="Times New Roman" w:cs="Times New Roman"/>
+        </w:rPr>
+        <w:t xml:space="preserve">There </w:t>
+      </w:r>
+      <w:r>
+        <w:rPr>
+          <w:rFonts w:ascii="Times New Roman" w:hAnsi="Times New Roman" w:cs="Times New Roman"/>
+        </w:rPr>
+        <w:t>are</w:t>
+      </w:r>
+      <w:r>
+        <w:rPr>
+          <w:rFonts w:ascii="Times New Roman" w:hAnsi="Times New Roman" w:cs="Times New Roman"/>
+        </w:rPr>
+        <w:t xml:space="preserve"> a minimum airflow </w:t>
+      </w:r>
+      <w:r>
+        <w:rPr>
+          <w:rFonts w:ascii="Times New Roman" w:hAnsi="Times New Roman" w:cs="Times New Roman"/>
+        </w:rPr>
+        <w:t>limit</w:t>
+      </w:r>
+      <w:r>
+        <w:rPr>
+          <w:rFonts w:ascii="Times New Roman" w:hAnsi="Times New Roman" w:cs="Times New Roman"/>
+        </w:rPr>
+        <w:t xml:space="preserve"> [___][as shown on the Point Schedule] (adj.) and a maximum airflow </w:t>
+      </w:r>
+      <w:r>
+        <w:rPr>
+          <w:rFonts w:ascii="Times New Roman" w:hAnsi="Times New Roman" w:cs="Times New Roman"/>
+        </w:rPr>
+        <w:t>limit</w:t>
+      </w:r>
+      <w:r>
+        <w:rPr>
+          <w:rFonts w:ascii="Times New Roman" w:hAnsi="Times New Roman" w:cs="Times New Roman"/>
+        </w:rPr>
+        <w:t xml:space="preserve"> [___][as shown on the Point Schedule] (adj.). </w:t>
+      </w:r>
+    </w:p>
+    <w:p>
+      <w:pPr>
+        <w:spacing w:after="0" w:line="240" w:lineRule="auto"/>
+        <w:ind w:left="1440"/>
+        <w:rPr>
+          <w:rFonts w:ascii="Times New Roman" w:hAnsi="Times New Roman" w:cs="Times New Roman"/>
+        </w:rPr>
+      </w:pPr>
+    </w:p>
+    <w:p>
+      <w:pPr>
+        <w:pStyle w:val="Heading5"/>
+      </w:pPr>
+      <w:r>
+        <w:t xml:space="preserve">3.2.4.2.2 Primary Air Damper </w:t>
+      </w:r>
+    </w:p>
+    <w:p>
+      <w:pPr>
+        <w:spacing w:after="0" w:line="240" w:lineRule="auto"/>
+        <w:ind w:left="1440"/>
+        <w:rPr>
+          <w:rFonts w:ascii="Times New Roman" w:hAnsi="Times New Roman" w:cs="Times New Roman"/>
+        </w:rPr>
+      </w:pPr>
     </w:p>
     <w:p>
       <w:pPr>
@@ -806,19 +1039,7 @@
         <w:rPr>
           <w:rFonts w:ascii="Times New Roman" w:hAnsi="Times New Roman" w:cs="Times New Roman"/>
         </w:rPr>
-        <w:t>Occupied heating setpoint is equal to the occupied setpoint minus [5</w:t>
-      </w:r>
-      <w:r>
-        <w:rPr>
-          <w:rFonts w:ascii="Times New Roman" w:hAnsi="Times New Roman" w:cs="Times New Roman"/>
-        </w:rPr>
-        <w:t>°F</w:t>
-      </w:r>
-      <w:r>
-        <w:rPr>
-          <w:rFonts w:ascii="Times New Roman" w:hAnsi="Times New Roman" w:cs="Times New Roman"/>
-        </w:rPr>
-        <w:t xml:space="preserve">][___][as shown on the Point Schedule] (adj.) for heating. </w:t>
+        <w:t xml:space="preserve">Modulate the primary air damper to maintain the effective primary airflow at setpoint. </w:t>
       </w:r>
     </w:p>
     <w:p>
@@ -832,373 +1053,16 @@
     </w:p>
     <w:p>
       <w:pPr>
-        <w:spacing w:after="0" w:line="240" w:lineRule="auto"/>
-        <w:ind w:left="2160"/>
-        <w:rPr>
-          <w:rFonts w:ascii="Times New Roman" w:hAnsi="Times New Roman" w:cs="Times New Roman"/>
-        </w:rPr>
-      </w:pPr>
-      <w:r>
-        <w:rPr>
-          <w:rFonts w:ascii="Times New Roman" w:hAnsi="Times New Roman" w:cs="Times New Roman"/>
-        </w:rPr>
-        <w:t>Occupied cooling setpoint is equal to the occupied setpoint plus [5</w:t>
-      </w:r>
-      <w:r>
-        <w:rPr>
-          <w:rFonts w:ascii="Times New Roman" w:hAnsi="Times New Roman" w:cs="Times New Roman"/>
-        </w:rPr>
-        <w:t>°F</w:t>
-      </w:r>
-      <w:r>
-        <w:rPr>
-          <w:rFonts w:ascii="Times New Roman" w:hAnsi="Times New Roman" w:cs="Times New Roman"/>
-        </w:rPr>
-        <w:t xml:space="preserve">][___][as shown on the Point Schedule] (adj.) for cooling. </w:t>
-      </w:r>
-    </w:p>
-    <w:p>
-      <w:pPr>
-        <w:spacing w:after="0" w:line="240" w:lineRule="auto"/>
-        <w:ind w:left="2160"/>
-        <w:rPr>
-          <w:rFonts w:ascii="Times New Roman" w:hAnsi="Times New Roman" w:cs="Times New Roman"/>
-        </w:rPr>
-      </w:pPr>
-    </w:p>
-    <w:p>
-      <w:pPr>
-        <w:spacing w:after="0" w:line="240" w:lineRule="auto"/>
-        <w:ind w:left="2160"/>
-        <w:rPr>
-          <w:rFonts w:ascii="Times New Roman" w:hAnsi="Times New Roman" w:cs="Times New Roman"/>
-        </w:rPr>
-      </w:pPr>
-      <w:r>
-        <w:rPr>
-          <w:rFonts w:ascii="Times New Roman" w:hAnsi="Times New Roman" w:cs="Times New Roman"/>
-        </w:rPr>
-        <w:t xml:space="preserve">Enable cooling mode whenever the zone temperature is above the effective cooling setpoint. Enable heating mode whenever the zone temperature is below the effective heating setpoint. </w:t>
-      </w:r>
-    </w:p>
-    <w:p>
-      <w:pPr>
-        <w:spacing w:after="0" w:line="240" w:lineRule="auto"/>
-        <w:ind w:left="720"/>
-        <w:rPr>
-          <w:rFonts w:ascii="Times New Roman" w:hAnsi="Times New Roman" w:cs="Times New Roman"/>
-        </w:rPr>
-      </w:pPr>
-    </w:p>
-    <w:p>
-      <w:pPr>
-        <w:spacing w:after="0" w:line="240" w:lineRule="auto"/>
-        <w:ind w:left="1440"/>
-        <w:rPr>
-          <w:rFonts w:ascii="Times New Roman" w:hAnsi="Times New Roman" w:cs="Times New Roman"/>
-        </w:rPr>
-      </w:pPr>
-      <w:r>
-        <w:rPr>
-          <w:rFonts w:ascii="Times New Roman" w:hAnsi="Times New Roman" w:cs="Times New Roman"/>
-        </w:rPr>
-        <w:t xml:space="preserve">3.2.4.1.2 </w:t>
-      </w:r>
-      <w:r>
-        <w:rPr>
-          <w:rStyle w:val="Toggle"/>
-        </w:rPr>
-        <w:t>[YES NC]</w:t>
-      </w:r>
-      <w:r>
-        <w:rPr>
-          <w:rFonts w:ascii="Times New Roman" w:hAnsi="Times New Roman" w:cs="Times New Roman"/>
-          <w:color w:val="FF0000"/>
-        </w:rPr>
-        <w:t xml:space="preserve"> </w:t>
-      </w:r>
-      <w:r>
-        <w:rPr>
-          <w:rFonts w:ascii="Times New Roman" w:hAnsi="Times New Roman" w:cs="Times New Roman"/>
-        </w:rPr>
-        <w:t xml:space="preserve">‘Need Cool’ Request </w:t>
-      </w:r>
-    </w:p>
-    <w:p>
-      <w:pPr>
-        <w:spacing w:after="0" w:line="240" w:lineRule="auto"/>
-        <w:ind w:left="1440"/>
-        <w:rPr>
-          <w:rFonts w:ascii="Times New Roman" w:hAnsi="Times New Roman" w:cs="Times New Roman"/>
-        </w:rPr>
-      </w:pPr>
-    </w:p>
-    <w:p>
-      <w:pPr>
-        <w:spacing w:after="0" w:line="240" w:lineRule="auto"/>
-        <w:ind w:left="2160"/>
-        <w:rPr>
-          <w:rFonts w:ascii="Times New Roman" w:hAnsi="Times New Roman" w:cs="Times New Roman"/>
-        </w:rPr>
-      </w:pPr>
-      <w:r>
-        <w:rPr>
-          <w:rFonts w:ascii="Times New Roman" w:hAnsi="Times New Roman" w:cs="Times New Roman"/>
-        </w:rPr>
-        <w:t xml:space="preserve">If zone temperature is above the effective cooling setpoint, send a ‘need cool’ request. </w:t>
-      </w:r>
-    </w:p>
-    <w:p>
-      <w:pPr>
-        <w:spacing w:after="0" w:line="240" w:lineRule="auto"/>
-        <w:ind w:left="1440"/>
-        <w:rPr>
-          <w:rFonts w:ascii="Times New Roman" w:hAnsi="Times New Roman" w:cs="Times New Roman"/>
-        </w:rPr>
-      </w:pPr>
-    </w:p>
-    <w:p>
-      <w:pPr>
-        <w:spacing w:after="0" w:line="240" w:lineRule="auto"/>
-        <w:ind w:left="1440"/>
-        <w:rPr>
-          <w:rFonts w:ascii="Times New Roman" w:hAnsi="Times New Roman" w:cs="Times New Roman"/>
-        </w:rPr>
-      </w:pPr>
-      <w:r>
-        <w:rPr>
-          <w:rFonts w:ascii="Times New Roman" w:hAnsi="Times New Roman" w:cs="Times New Roman"/>
-        </w:rPr>
-        <w:t xml:space="preserve">3.2.4.1.3 </w:t>
-      </w:r>
-      <w:r>
-        <w:rPr>
-          <w:rStyle w:val="Toggle"/>
-        </w:rPr>
-        <w:t>[YES NH]</w:t>
-      </w:r>
-      <w:r>
-        <w:rPr>
-          <w:rFonts w:ascii="Times New Roman" w:hAnsi="Times New Roman" w:cs="Times New Roman"/>
-          <w:color w:val="FF0000"/>
-        </w:rPr>
-        <w:t xml:space="preserve"> </w:t>
-      </w:r>
-      <w:r>
-        <w:rPr>
-          <w:rFonts w:ascii="Times New Roman" w:hAnsi="Times New Roman" w:cs="Times New Roman"/>
-        </w:rPr>
-        <w:t xml:space="preserve">‘Need Heat’ Request </w:t>
-      </w:r>
-    </w:p>
-    <w:p>
-      <w:pPr>
-        <w:spacing w:after="0" w:line="240" w:lineRule="auto"/>
-        <w:ind w:left="1440"/>
-        <w:rPr>
-          <w:rFonts w:ascii="Times New Roman" w:hAnsi="Times New Roman" w:cs="Times New Roman"/>
-        </w:rPr>
-      </w:pPr>
-    </w:p>
-    <w:p>
-      <w:pPr>
-        <w:spacing w:after="0" w:line="240" w:lineRule="auto"/>
-        <w:ind w:left="2160"/>
-        <w:rPr>
-          <w:rFonts w:ascii="Times New Roman" w:hAnsi="Times New Roman" w:cs="Times New Roman"/>
-        </w:rPr>
-      </w:pPr>
-      <w:r>
-        <w:rPr>
-          <w:rFonts w:ascii="Times New Roman" w:hAnsi="Times New Roman" w:cs="Times New Roman"/>
-        </w:rPr>
-        <w:t xml:space="preserve">If zone temperature is above the effective heating setpoint, send a ‘need heat’ request. </w:t>
-      </w:r>
-    </w:p>
-    <w:p>
-      <w:pPr>
-        <w:spacing w:after="0" w:line="240" w:lineRule="auto"/>
-        <w:rPr>
-          <w:rFonts w:ascii="Times New Roman" w:hAnsi="Times New Roman" w:cs="Times New Roman"/>
-        </w:rPr>
-      </w:pPr>
-    </w:p>
-    <w:p>
-      <w:pPr>
-        <w:spacing w:after="0" w:line="240" w:lineRule="auto"/>
-        <w:ind w:left="720"/>
-        <w:rPr>
-          <w:rFonts w:ascii="Times New Roman" w:hAnsi="Times New Roman" w:cs="Times New Roman"/>
-        </w:rPr>
-      </w:pPr>
-      <w:r>
-        <w:rPr>
-          <w:rFonts w:ascii="Times New Roman" w:hAnsi="Times New Roman" w:cs="Times New Roman"/>
-        </w:rPr>
-        <w:t xml:space="preserve">3.2.4.2 Zone Airflow Control </w:t>
-      </w:r>
-    </w:p>
-    <w:p>
-      <w:pPr>
-        <w:spacing w:after="0" w:line="240" w:lineRule="auto"/>
-        <w:ind w:left="720"/>
-        <w:rPr>
-          <w:rFonts w:ascii="Times New Roman" w:hAnsi="Times New Roman" w:cs="Times New Roman"/>
-        </w:rPr>
-      </w:pPr>
-    </w:p>
-    <w:p>
-      <w:pPr>
-        <w:spacing w:after="0" w:line="240" w:lineRule="auto"/>
-        <w:ind w:left="1440"/>
-        <w:rPr>
-          <w:rFonts w:ascii="Times New Roman" w:hAnsi="Times New Roman" w:cs="Times New Roman"/>
-        </w:rPr>
-      </w:pPr>
-      <w:r>
-        <w:rPr>
-          <w:rFonts w:ascii="Times New Roman" w:hAnsi="Times New Roman" w:cs="Times New Roman"/>
-        </w:rPr>
-        <w:t xml:space="preserve">3.2.4.2.1 Airflow Setpoint </w:t>
-      </w:r>
-    </w:p>
-    <w:p>
-      <w:pPr>
-        <w:spacing w:after="0" w:line="240" w:lineRule="auto"/>
-        <w:ind w:left="1440"/>
-        <w:rPr>
-          <w:rFonts w:ascii="Times New Roman" w:hAnsi="Times New Roman" w:cs="Times New Roman"/>
-        </w:rPr>
-      </w:pPr>
-    </w:p>
-    <w:p>
-      <w:pPr>
-        <w:spacing w:after="0" w:line="240" w:lineRule="auto"/>
-        <w:ind w:left="2160"/>
-        <w:rPr>
-          <w:rFonts w:ascii="Times New Roman" w:hAnsi="Times New Roman" w:cs="Times New Roman"/>
-        </w:rPr>
-      </w:pPr>
-      <w:r>
-        <w:rPr>
-          <w:rFonts w:ascii="Times New Roman" w:hAnsi="Times New Roman" w:cs="Times New Roman"/>
-        </w:rPr>
-        <w:t xml:space="preserve">There </w:t>
-      </w:r>
-      <w:r>
-        <w:rPr>
-          <w:rFonts w:ascii="Times New Roman" w:hAnsi="Times New Roman" w:cs="Times New Roman"/>
-        </w:rPr>
-        <w:t>are</w:t>
-      </w:r>
-      <w:r>
-        <w:rPr>
-          <w:rFonts w:ascii="Times New Roman" w:hAnsi="Times New Roman" w:cs="Times New Roman"/>
-        </w:rPr>
-        <w:t xml:space="preserve"> a minimum airflow </w:t>
-      </w:r>
-      <w:r>
-        <w:rPr>
-          <w:rFonts w:ascii="Times New Roman" w:hAnsi="Times New Roman" w:cs="Times New Roman"/>
-        </w:rPr>
-        <w:t>limit</w:t>
-      </w:r>
-      <w:r>
-        <w:rPr>
-          <w:rFonts w:ascii="Times New Roman" w:hAnsi="Times New Roman" w:cs="Times New Roman"/>
-        </w:rPr>
-        <w:t xml:space="preserve"> [___][as shown on the Point Schedule] (adj.) and a maximum airflow </w:t>
-      </w:r>
-      <w:r>
-        <w:rPr>
-          <w:rFonts w:ascii="Times New Roman" w:hAnsi="Times New Roman" w:cs="Times New Roman"/>
-        </w:rPr>
-        <w:t>limit</w:t>
-      </w:r>
-      <w:r>
-        <w:rPr>
-          <w:rFonts w:ascii="Times New Roman" w:hAnsi="Times New Roman" w:cs="Times New Roman"/>
-        </w:rPr>
-        <w:t xml:space="preserve"> [___][as shown on the Point Schedule] (adj.). </w:t>
-      </w:r>
-    </w:p>
-    <w:p>
-      <w:pPr>
-        <w:spacing w:after="0" w:line="240" w:lineRule="auto"/>
-        <w:ind w:left="1440"/>
-        <w:rPr>
-          <w:rFonts w:ascii="Times New Roman" w:hAnsi="Times New Roman" w:cs="Times New Roman"/>
-        </w:rPr>
-      </w:pPr>
-    </w:p>
-    <w:p>
-      <w:pPr>
-        <w:spacing w:after="0" w:line="240" w:lineRule="auto"/>
-        <w:ind w:left="1440"/>
-        <w:rPr>
-          <w:rFonts w:ascii="Times New Roman" w:hAnsi="Times New Roman" w:cs="Times New Roman"/>
-        </w:rPr>
-      </w:pPr>
-      <w:r>
-        <w:rPr>
-          <w:rFonts w:ascii="Times New Roman" w:hAnsi="Times New Roman" w:cs="Times New Roman"/>
-        </w:rPr>
-        <w:t xml:space="preserve">3.2.4.2.2 Primary Air Damper </w:t>
-      </w:r>
-    </w:p>
-    <w:p>
-      <w:pPr>
-        <w:spacing w:after="0" w:line="240" w:lineRule="auto"/>
-        <w:ind w:left="1440"/>
-        <w:rPr>
-          <w:rFonts w:ascii="Times New Roman" w:hAnsi="Times New Roman" w:cs="Times New Roman"/>
-        </w:rPr>
-      </w:pPr>
-    </w:p>
-    <w:p>
-      <w:pPr>
-        <w:spacing w:after="0" w:line="240" w:lineRule="auto"/>
-        <w:ind w:left="2160"/>
-        <w:rPr>
-          <w:rFonts w:ascii="Times New Roman" w:hAnsi="Times New Roman" w:cs="Times New Roman"/>
-        </w:rPr>
-      </w:pPr>
-      <w:r>
-        <w:rPr>
-          <w:rFonts w:ascii="Times New Roman" w:hAnsi="Times New Roman" w:cs="Times New Roman"/>
-        </w:rPr>
-        <w:t xml:space="preserve">Modulate the primary air damper to maintain the effective primary airflow at setpoint. </w:t>
-      </w:r>
-    </w:p>
-    <w:p>
-      <w:pPr>
-        <w:spacing w:after="0" w:line="240" w:lineRule="auto"/>
-        <w:ind w:left="2160"/>
-        <w:rPr>
-          <w:rFonts w:ascii="Times New Roman" w:hAnsi="Times New Roman" w:cs="Times New Roman"/>
-        </w:rPr>
-      </w:pPr>
-    </w:p>
-    <w:p>
-      <w:pPr>
-        <w:spacing w:after="0" w:line="240" w:lineRule="auto"/>
-        <w:ind w:left="1440"/>
-        <w:rPr>
-          <w:rFonts w:ascii="Times New Roman" w:hAnsi="Times New Roman" w:cs="Times New Roman"/>
-        </w:rPr>
+        <w:pStyle w:val="Heading5"/>
       </w:pPr>
       <w:commentRangeStart w:id="0"/>
       <w:r>
-        <w:rPr>
-          <w:rFonts w:ascii="Times New Roman" w:hAnsi="Times New Roman" w:cs="Times New Roman"/>
-        </w:rPr>
         <w:t xml:space="preserve">3.2.4.2.3 Cool Mode </w:t>
       </w:r>
       <w:commentRangeEnd w:id="0"/>
       <w:r>
         <w:rPr>
           <w:rStyle w:val="CommentReference"/>
-          <w:rFonts w:ascii="Times New Roman" w:hAnsi="Times New Roman" w:cs="Times New Roman"/>
           <w:sz w:val="24"/>
           <w:szCs w:val="24"/>
         </w:rPr>
@@ -1251,17 +1115,94 @@
     </w:p>
     <w:p>
       <w:pPr>
+        <w:pStyle w:val="Heading5"/>
+      </w:pPr>
+      <w:r>
+        <w:t xml:space="preserve">3.2.4.2.4 Heat Mode </w:t>
+      </w:r>
+    </w:p>
+    <w:p>
+      <w:pPr>
         <w:spacing w:after="0" w:line="240" w:lineRule="auto"/>
         <w:ind w:left="1440"/>
         <w:rPr>
           <w:rFonts w:ascii="Times New Roman" w:hAnsi="Times New Roman" w:cs="Times New Roman"/>
         </w:rPr>
       </w:pPr>
-      <w:r>
-        <w:rPr>
-          <w:rFonts w:ascii="Times New Roman" w:hAnsi="Times New Roman" w:cs="Times New Roman"/>
-        </w:rPr>
-        <w:t xml:space="preserve">3.2.4.2.4 Heat Mode </w:t>
+    </w:p>
+    <w:p>
+      <w:pPr>
+        <w:spacing w:after="0" w:line="240" w:lineRule="auto"/>
+        <w:ind w:left="2160"/>
+        <w:rPr>
+          <w:rFonts w:ascii="Times New Roman" w:hAnsi="Times New Roman" w:cs="Times New Roman"/>
+        </w:rPr>
+      </w:pPr>
+      <w:r>
+        <w:rPr>
+          <w:rFonts w:ascii="Times New Roman" w:hAnsi="Times New Roman" w:cs="Times New Roman"/>
+        </w:rPr>
+        <w:t xml:space="preserve">Maintain the primary airflow setpoint at the minimum flow limit. Reset the effective primary airflow setpoint towards the maximum limit whenever the heating is at maximum and zone temperature is still below the heating setpoint. When the heating mode is satisfied, reset the effective primary airflow setpoint towards the minimum limit. </w:t>
+      </w:r>
+    </w:p>
+    <w:p>
+      <w:pPr>
+        <w:spacing w:after="0" w:line="240" w:lineRule="auto"/>
+        <w:rPr>
+          <w:rFonts w:ascii="Times New Roman" w:hAnsi="Times New Roman" w:cs="Times New Roman"/>
+        </w:rPr>
+      </w:pPr>
+    </w:p>
+    <w:p>
+      <w:pPr>
+        <w:pStyle w:val="Heading4"/>
+      </w:pPr>
+      <w:r>
+        <w:t xml:space="preserve">3.2.4.3 Heating Control </w:t>
+      </w:r>
+    </w:p>
+    <w:p>
+      <w:pPr>
+        <w:spacing w:after="0" w:line="240" w:lineRule="auto"/>
+        <w:ind w:left="720"/>
+        <w:rPr>
+          <w:rFonts w:ascii="Times New Roman" w:hAnsi="Times New Roman" w:cs="Times New Roman"/>
+        </w:rPr>
+      </w:pPr>
+    </w:p>
+    <w:p>
+      <w:pPr>
+        <w:pStyle w:val="Heading5"/>
+      </w:pPr>
+      <w:r>
+        <w:t xml:space="preserve">3.2.4.3.1 </w:t>
+      </w:r>
+      <w:r>
+        <w:rPr>
+          <w:rStyle w:val="Toggle"/>
+        </w:rPr>
+        <w:t xml:space="preserve">[EQUALS </w:t>
+      </w:r>
+      <w:r>
+        <w:rPr>
+          <w:rStyle w:val="Toggle"/>
+        </w:rPr>
+        <w:t>TERM_HT HW</w:t>
+      </w:r>
+      <w:r>
+        <w:rPr>
+          <w:rStyle w:val="Toggle"/>
+        </w:rPr>
+        <w:t>]</w:t>
+      </w:r>
+      <w:r>
+        <w:rPr>
+          <w:color w:val="FF0000"/>
+        </w:rPr>
+        <w:t xml:space="preserve"> </w:t>
+      </w:r>
+      <w:r>
+        <w:t xml:space="preserve">Hot Water Heating Coil </w:t>
       </w:r>
     </w:p>
     <w:p>
@@ -1285,40 +1226,8 @@
         <w:rPr>
           <w:rFonts w:ascii="Times New Roman" w:hAnsi="Times New Roman" w:cs="Times New Roman"/>
         </w:rPr>
-        <w:t xml:space="preserve">Maintain the primary airflow setpoint at the minimum flow limit. Reset the effective primary airflow setpoint towards the maximum limit whenever the heating is at maximum and zone temperature is still below the heating setpoint. When the heating mode is satisfied, reset the effective primary airflow setpoint towards the minimum limit. </w:t>
-      </w:r>
-    </w:p>
-    <w:p>
-      <w:pPr>
-        <w:spacing w:after="0" w:line="240" w:lineRule="auto"/>
-        <w:rPr>
-          <w:rFonts w:ascii="Times New Roman" w:hAnsi="Times New Roman" w:cs="Times New Roman"/>
-        </w:rPr>
-      </w:pPr>
-    </w:p>
-    <w:p>
-      <w:pPr>
-        <w:spacing w:after="0" w:line="240" w:lineRule="auto"/>
-        <w:ind w:left="720"/>
-        <w:rPr>
-          <w:rFonts w:ascii="Times New Roman" w:hAnsi="Times New Roman" w:cs="Times New Roman"/>
-        </w:rPr>
-      </w:pPr>
-      <w:r>
-        <w:rPr>
-          <w:rFonts w:ascii="Times New Roman" w:hAnsi="Times New Roman" w:cs="Times New Roman"/>
-        </w:rPr>
-        <w:t xml:space="preserve">3.2.4.3 Heating Control </w:t>
-      </w:r>
-    </w:p>
-    <w:p>
-      <w:pPr>
-        <w:spacing w:after="0" w:line="240" w:lineRule="auto"/>
-        <w:ind w:left="720"/>
-        <w:rPr>
-          <w:rFonts w:ascii="Times New Roman" w:hAnsi="Times New Roman" w:cs="Times New Roman"/>
-        </w:rPr>
-      </w:pPr>
+        <w:t xml:space="preserve">Modulate the heating hot water coil valve to maintain the zone temperature at the effective heating mode temperature setpoint whenever the zone is in heating mode. Otherwise, command the heating hot water valve closed. </w:t>
+      </w:r>
     </w:p>
     <w:p>
       <w:pPr>
@@ -1328,89 +1237,12 @@
           <w:rFonts w:ascii="Times New Roman" w:hAnsi="Times New Roman" w:cs="Times New Roman"/>
         </w:rPr>
       </w:pPr>
-      <w:r>
-        <w:rPr>
-          <w:rFonts w:ascii="Times New Roman" w:hAnsi="Times New Roman" w:cs="Times New Roman"/>
-        </w:rPr>
-        <w:t xml:space="preserve">3.2.4.3.1 </w:t>
-      </w:r>
-      <w:r>
-        <w:rPr>
-          <w:rStyle w:val="Toggle"/>
-        </w:rPr>
-        <w:t xml:space="preserve">[EQUALS </w:t>
-      </w:r>
-      <w:r>
-        <w:rPr>
-          <w:rStyle w:val="Toggle"/>
-        </w:rPr>
-        <w:t>TERM_HT HW</w:t>
-      </w:r>
-      <w:r>
-        <w:rPr>
-          <w:rStyle w:val="Toggle"/>
-        </w:rPr>
-        <w:t>]</w:t>
-      </w:r>
-      <w:r>
-        <w:rPr>
-          <w:rFonts w:ascii="Times New Roman" w:hAnsi="Times New Roman" w:cs="Times New Roman"/>
-          <w:color w:val="FF0000"/>
-        </w:rPr>
-        <w:t xml:space="preserve"> </w:t>
-      </w:r>
-      <w:r>
-        <w:rPr>
-          <w:rFonts w:ascii="Times New Roman" w:hAnsi="Times New Roman" w:cs="Times New Roman"/>
-        </w:rPr>
-        <w:t xml:space="preserve">Hot Water Heating Coil </w:t>
-      </w:r>
-    </w:p>
-    <w:p>
-      <w:pPr>
-        <w:spacing w:after="0" w:line="240" w:lineRule="auto"/>
-        <w:ind w:left="1440"/>
-        <w:rPr>
-          <w:rFonts w:ascii="Times New Roman" w:hAnsi="Times New Roman" w:cs="Times New Roman"/>
-        </w:rPr>
-      </w:pPr>
-    </w:p>
-    <w:p>
-      <w:pPr>
-        <w:spacing w:after="0" w:line="240" w:lineRule="auto"/>
-        <w:ind w:left="2160"/>
-        <w:rPr>
-          <w:rFonts w:ascii="Times New Roman" w:hAnsi="Times New Roman" w:cs="Times New Roman"/>
-        </w:rPr>
-      </w:pPr>
-      <w:r>
-        <w:rPr>
-          <w:rFonts w:ascii="Times New Roman" w:hAnsi="Times New Roman" w:cs="Times New Roman"/>
-        </w:rPr>
-        <w:t xml:space="preserve">Modulate the heating hot water coil valve to maintain the zone temperature at the effective heating mode temperature setpoint whenever the zone is in heating mode. Otherwise, command the heating hot water valve closed. </w:t>
-      </w:r>
-    </w:p>
-    <w:p>
-      <w:pPr>
-        <w:spacing w:after="0" w:line="240" w:lineRule="auto"/>
-        <w:ind w:left="1440"/>
-        <w:rPr>
-          <w:rFonts w:ascii="Times New Roman" w:hAnsi="Times New Roman" w:cs="Times New Roman"/>
-        </w:rPr>
-      </w:pPr>
-    </w:p>
-    <w:p>
-      <w:pPr>
-        <w:spacing w:after="0" w:line="240" w:lineRule="auto"/>
-        <w:ind w:left="1440"/>
-        <w:rPr>
-          <w:rFonts w:ascii="Times New Roman" w:hAnsi="Times New Roman" w:cs="Times New Roman"/>
-        </w:rPr>
-      </w:pPr>
-      <w:r>
-        <w:rPr>
-          <w:rFonts w:ascii="Times New Roman" w:hAnsi="Times New Roman" w:cs="Times New Roman"/>
-        </w:rPr>
+    </w:p>
+    <w:p>
+      <w:pPr>
+        <w:pStyle w:val="Heading5"/>
+      </w:pPr>
+      <w:r>
         <w:t xml:space="preserve">3.2.4.3.2 </w:t>
       </w:r>
       <w:r>
@@ -1450,15 +1282,11 @@
       </w:r>
       <w:r>
         <w:rPr>
-          <w:rFonts w:ascii="Times New Roman" w:hAnsi="Times New Roman" w:cs="Times New Roman"/>
           <w:color w:val="FF0000"/>
         </w:rPr>
         <w:t xml:space="preserve"> </w:t>
       </w:r>
       <w:r>
-        <w:rPr>
-          <w:rFonts w:ascii="Times New Roman" w:hAnsi="Times New Roman" w:cs="Times New Roman"/>
-        </w:rPr>
         <w:t xml:space="preserve">Electric Heat </w:t>
       </w:r>
     </w:p>
@@ -1496,15 +1324,9 @@
     </w:p>
     <w:p>
       <w:pPr>
-        <w:spacing w:after="0" w:line="240" w:lineRule="auto"/>
-        <w:rPr>
-          <w:rFonts w:ascii="Times New Roman" w:hAnsi="Times New Roman" w:cs="Times New Roman"/>
-        </w:rPr>
-      </w:pPr>
-      <w:r>
-        <w:rPr>
-          <w:rFonts w:ascii="Times New Roman" w:hAnsi="Times New Roman" w:cs="Times New Roman"/>
-        </w:rPr>
+        <w:pStyle w:val="Heading3"/>
+      </w:pPr>
+      <w:r>
         <w:t xml:space="preserve">3.2.5 </w:t>
       </w:r>
       <w:r>
@@ -1520,9 +1342,6 @@
         <w:t xml:space="preserve">PFBCV SFBCV] </w:t>
       </w:r>
       <w:r>
-        <w:rPr>
-          <w:rFonts w:ascii="Times New Roman" w:hAnsi="Times New Roman" w:cs="Times New Roman"/>
-        </w:rPr>
         <w:t xml:space="preserve">VAV Box –Fan-Powered </w:t>
       </w:r>
     </w:p>
@@ -1535,11 +1354,15 @@
       </w:pPr>
       <w:r>
         <w:rPr>
-          <w:rFonts w:ascii="Times New Roman" w:hAnsi="Times New Roman" w:cs="Times New Roman"/>
           <w:noProof/>
         </w:rPr>
-        <w:pict w14:anchorId="043ABC43">
-          <v:rect id="_x0000_i1026" alt="" style="width:468pt;height:.05pt;mso-width-percent:0;mso-height-percent:0;mso-width-percent:0;mso-height-percent:0" o:hralign="center" o:hrstd="t" o:hr="t" fillcolor="#a0a0a0" stroked="f"/>
+      </w:r>
+      <w:r>
+        <w:pict w14:anchorId="7640B199">
+          <v:rect id="Horizontal Line 5" o:spid="_x0000_s1027" style="width:468pt;height:.05pt;visibility:visible;mso-wrap-style:square;mso-left-percent:-10001;mso-top-percent:-10001;mso-position-horizontal:absolute;mso-position-horizontal-relative:char;mso-position-vertical:absolute;mso-position-vertical-relative:line;mso-left-percent:-10001;mso-top-percent:-10001;v-text-anchor:top" o:gfxdata="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" filled="f">
+            <o:lock v:ext="edit" rotation="t" aspectratio="t" verticies="t" text="t" shapetype="t"/>
+            <w10:anchorlock/>
+          </v:rect>
         </w:pict>
       </w:r>
     </w:p>
@@ -1721,11 +1544,15 @@
       </w:pPr>
       <w:r>
         <w:rPr>
-          <w:rFonts w:ascii="Times New Roman" w:hAnsi="Times New Roman" w:cs="Times New Roman"/>
           <w:noProof/>
         </w:rPr>
-        <w:pict w14:anchorId="6C6DAB3A">
-          <v:rect id="_x0000_i1025" alt="" style="width:468pt;height:.05pt;mso-width-percent:0;mso-height-percent:0;mso-width-percent:0;mso-height-percent:0" o:hralign="center" o:hrstd="t" o:hr="t" fillcolor="#a0a0a0" stroked="f"/>
+      </w:r>
+      <w:r>
+        <w:pict w14:anchorId="10F2CDDB">
+          <v:rect id="Horizontal Line 6" o:spid="_x0000_s1026" style="width:468pt;height:.05pt;visibility:visible;mso-wrap-style:square;mso-left-percent:-10001;mso-top-percent:-10001;mso-position-horizontal:absolute;mso-position-horizontal-relative:char;mso-position-vertical:absolute;mso-position-vertical-relative:line;mso-left-percent:-10001;mso-top-percent:-10001;v-text-anchor:top" o:gfxdata="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" filled="f">
+            <o:lock v:ext="edit" rotation="t" aspectratio="t" verticies="t" text="t" shapetype="t"/>
+            <w10:anchorlock/>
+          </v:rect>
         </w:pict>
       </w:r>
     </w:p>
@@ -1739,17 +1566,198 @@
     </w:p>
     <w:p>
       <w:pPr>
+        <w:pStyle w:val="Heading5"/>
+      </w:pPr>
+      <w:r>
+        <w:t xml:space="preserve">3.2.5.1.1 Temperature Setpoint </w:t>
+      </w:r>
+    </w:p>
+    <w:p>
+      <w:pPr>
         <w:spacing w:after="0" w:line="240" w:lineRule="auto"/>
         <w:ind w:left="1440"/>
         <w:rPr>
           <w:rFonts w:ascii="Times New Roman" w:hAnsi="Times New Roman" w:cs="Times New Roman"/>
         </w:rPr>
       </w:pPr>
-      <w:r>
-        <w:rPr>
-          <w:rFonts w:ascii="Times New Roman" w:hAnsi="Times New Roman" w:cs="Times New Roman"/>
-        </w:rPr>
-        <w:t xml:space="preserve">3.2.5.1.1 Temperature Setpoint </w:t>
+    </w:p>
+    <w:p>
+      <w:pPr>
+        <w:spacing w:after="0" w:line="240" w:lineRule="auto"/>
+        <w:ind w:left="2160"/>
+        <w:rPr>
+          <w:rFonts w:ascii="Times New Roman" w:hAnsi="Times New Roman" w:cs="Times New Roman"/>
+        </w:rPr>
+      </w:pPr>
+      <w:r>
+        <w:rPr>
+          <w:rFonts w:ascii="Times New Roman" w:hAnsi="Times New Roman" w:cs="Times New Roman"/>
+        </w:rPr>
+        <w:t>Three independent temperature setpoints apply to the unit: 1) an occupied setpoint equal to [73</w:t>
+      </w:r>
+      <w:r>
+        <w:rPr>
+          <w:rFonts w:ascii="Times New Roman" w:hAnsi="Times New Roman" w:cs="Times New Roman"/>
+        </w:rPr>
+        <w:t>°F</w:t>
+      </w:r>
+      <w:r>
+        <w:rPr>
+          <w:rFonts w:ascii="Times New Roman" w:hAnsi="Times New Roman" w:cs="Times New Roman"/>
+        </w:rPr>
+        <w:t>][___][as shown on the Point Schedule] (adj.) plus an adjustable offset from a zone thermostat, 2) an unoccupied heating setpoint [63</w:t>
+      </w:r>
+      <w:r>
+        <w:rPr>
+          <w:rFonts w:ascii="Times New Roman" w:hAnsi="Times New Roman" w:cs="Times New Roman"/>
+        </w:rPr>
+        <w:t>°F</w:t>
+      </w:r>
+      <w:r>
+        <w:rPr>
+          <w:rFonts w:ascii="Times New Roman" w:hAnsi="Times New Roman" w:cs="Times New Roman"/>
+        </w:rPr>
+        <w:t>][___][as shown on the Point Schedule] (adj.), and 3) an unoccupied cooling setpoint [83</w:t>
+      </w:r>
+      <w:r>
+        <w:rPr>
+          <w:rFonts w:ascii="Times New Roman" w:hAnsi="Times New Roman" w:cs="Times New Roman"/>
+        </w:rPr>
+        <w:t>°F</w:t>
+      </w:r>
+      <w:r>
+        <w:rPr>
+          <w:rFonts w:ascii="Times New Roman" w:hAnsi="Times New Roman" w:cs="Times New Roman"/>
+        </w:rPr>
+        <w:t xml:space="preserve">][___][as shown on the Point Schedule] (adj.). The occupied heating and cooling setpoints are calculated as described below. </w:t>
+      </w:r>
+    </w:p>
+    <w:p>
+      <w:pPr>
+        <w:spacing w:after="0" w:line="240" w:lineRule="auto"/>
+        <w:ind w:left="2160"/>
+        <w:rPr>
+          <w:rFonts w:ascii="Times New Roman" w:hAnsi="Times New Roman" w:cs="Times New Roman"/>
+        </w:rPr>
+      </w:pPr>
+    </w:p>
+    <w:p>
+      <w:pPr>
+        <w:spacing w:after="0" w:line="240" w:lineRule="auto"/>
+        <w:ind w:left="2160"/>
+        <w:rPr>
+          <w:rFonts w:ascii="Times New Roman" w:hAnsi="Times New Roman" w:cs="Times New Roman"/>
+        </w:rPr>
+      </w:pPr>
+      <w:r>
+        <w:rPr>
+          <w:rFonts w:ascii="Times New Roman" w:hAnsi="Times New Roman" w:cs="Times New Roman"/>
+        </w:rPr>
+        <w:t>Occupied heating setpoint is equal to the occupied setpoint minus [5</w:t>
+      </w:r>
+      <w:r>
+        <w:rPr>
+          <w:rFonts w:ascii="Times New Roman" w:hAnsi="Times New Roman" w:cs="Times New Roman"/>
+        </w:rPr>
+        <w:t>°F</w:t>
+      </w:r>
+      <w:r>
+        <w:rPr>
+          <w:rFonts w:ascii="Times New Roman" w:hAnsi="Times New Roman" w:cs="Times New Roman"/>
+        </w:rPr>
+        <w:t xml:space="preserve">][___][as shown on the Point Schedule] (adj.) for heating. </w:t>
+      </w:r>
+    </w:p>
+    <w:p>
+      <w:pPr>
+        <w:spacing w:after="0" w:line="240" w:lineRule="auto"/>
+        <w:ind w:left="2160"/>
+        <w:rPr>
+          <w:rFonts w:ascii="Times New Roman" w:hAnsi="Times New Roman" w:cs="Times New Roman"/>
+        </w:rPr>
+      </w:pPr>
+    </w:p>
+    <w:p>
+      <w:pPr>
+        <w:spacing w:after="0" w:line="240" w:lineRule="auto"/>
+        <w:ind w:left="2160"/>
+        <w:rPr>
+          <w:rFonts w:ascii="Times New Roman" w:hAnsi="Times New Roman" w:cs="Times New Roman"/>
+        </w:rPr>
+      </w:pPr>
+      <w:r>
+        <w:rPr>
+          <w:rFonts w:ascii="Times New Roman" w:hAnsi="Times New Roman" w:cs="Times New Roman"/>
+        </w:rPr>
+        <w:t>Occupied cooling setpoint is equal to the occupied setpoint plus [5</w:t>
+      </w:r>
+      <w:r>
+        <w:rPr>
+          <w:rFonts w:ascii="Times New Roman" w:hAnsi="Times New Roman" w:cs="Times New Roman"/>
+        </w:rPr>
+        <w:t>°F</w:t>
+      </w:r>
+      <w:r>
+        <w:rPr>
+          <w:rFonts w:ascii="Times New Roman" w:hAnsi="Times New Roman" w:cs="Times New Roman"/>
+        </w:rPr>
+        <w:t xml:space="preserve">][___][as shown on the Point Schedule] (adj.) for cooling. </w:t>
+      </w:r>
+    </w:p>
+    <w:p>
+      <w:pPr>
+        <w:spacing w:after="0" w:line="240" w:lineRule="auto"/>
+        <w:ind w:left="2160"/>
+        <w:rPr>
+          <w:rFonts w:ascii="Times New Roman" w:hAnsi="Times New Roman" w:cs="Times New Roman"/>
+        </w:rPr>
+      </w:pPr>
+    </w:p>
+    <w:p>
+      <w:pPr>
+        <w:spacing w:after="0" w:line="240" w:lineRule="auto"/>
+        <w:ind w:left="2160"/>
+        <w:rPr>
+          <w:rFonts w:ascii="Times New Roman" w:hAnsi="Times New Roman" w:cs="Times New Roman"/>
+        </w:rPr>
+      </w:pPr>
+      <w:r>
+        <w:rPr>
+          <w:rFonts w:ascii="Times New Roman" w:hAnsi="Times New Roman" w:cs="Times New Roman"/>
+        </w:rPr>
+        <w:t xml:space="preserve">Enable cooling mode whenever the zone temperature is above the effective cooling setpoint. Enable heating mode whenever the zone temperature is below the effective heating setpoint. </w:t>
+      </w:r>
+    </w:p>
+    <w:p>
+      <w:pPr>
+        <w:spacing w:after="0" w:line="240" w:lineRule="auto"/>
+        <w:ind w:left="720"/>
+        <w:rPr>
+          <w:rFonts w:ascii="Times New Roman" w:hAnsi="Times New Roman" w:cs="Times New Roman"/>
+        </w:rPr>
+      </w:pPr>
+    </w:p>
+    <w:p>
+      <w:pPr>
+        <w:pStyle w:val="Heading5"/>
+      </w:pPr>
+      <w:r>
+        <w:t xml:space="preserve">3.2.5.1.2 </w:t>
+      </w:r>
+      <w:r>
+        <w:rPr>
+          <w:rStyle w:val="Toggle"/>
+        </w:rPr>
+        <w:t>[YES NC]</w:t>
+      </w:r>
+      <w:r>
+        <w:rPr>
+          <w:color w:val="FF0000"/>
+        </w:rPr>
+        <w:t xml:space="preserve"> </w:t>
+      </w:r>
+      <w:r>
+        <w:t xml:space="preserve">‘Need Cool’ Request </w:t>
       </w:r>
     </w:p>
     <w:p>
@@ -1773,44 +1781,49 @@
         <w:rPr>
           <w:rFonts w:ascii="Times New Roman" w:hAnsi="Times New Roman" w:cs="Times New Roman"/>
         </w:rPr>
-        <w:t>Three independent temperature setpoints apply to the unit: 1) an occupied setpoint equal to [73</w:t>
-      </w:r>
-      <w:r>
-        <w:rPr>
-          <w:rFonts w:ascii="Times New Roman" w:hAnsi="Times New Roman" w:cs="Times New Roman"/>
-        </w:rPr>
-        <w:t>°F</w:t>
-      </w:r>
-      <w:r>
-        <w:rPr>
-          <w:rFonts w:ascii="Times New Roman" w:hAnsi="Times New Roman" w:cs="Times New Roman"/>
-        </w:rPr>
-        <w:t>][___][as shown on the Point Schedule] (adj.) plus an adjustable offset from a zone thermostat, 2) an unoccupied heating setpoint [63</w:t>
-      </w:r>
-      <w:r>
-        <w:rPr>
-          <w:rFonts w:ascii="Times New Roman" w:hAnsi="Times New Roman" w:cs="Times New Roman"/>
-        </w:rPr>
-        <w:t>°F</w:t>
-      </w:r>
-      <w:r>
-        <w:rPr>
-          <w:rFonts w:ascii="Times New Roman" w:hAnsi="Times New Roman" w:cs="Times New Roman"/>
-        </w:rPr>
-        <w:t>][___][as shown on the Point Schedule] (adj.), and 3) an unoccupied cooling setpoint [83</w:t>
-      </w:r>
-      <w:r>
-        <w:rPr>
-          <w:rFonts w:ascii="Times New Roman" w:hAnsi="Times New Roman" w:cs="Times New Roman"/>
-        </w:rPr>
-        <w:t>°F</w:t>
-      </w:r>
-      <w:r>
-        <w:rPr>
-          <w:rFonts w:ascii="Times New Roman" w:hAnsi="Times New Roman" w:cs="Times New Roman"/>
-        </w:rPr>
-        <w:t xml:space="preserve">][___][as shown on the Point Schedule] (adj.). The occupied heating and cooling setpoints are calculated as described below. </w:t>
-      </w:r>
+        <w:t xml:space="preserve">If zone temperature is above the effective cooling setpoint, send a ‘need cool’ request. </w:t>
+      </w:r>
+    </w:p>
+    <w:p>
+      <w:pPr>
+        <w:spacing w:after="0" w:line="240" w:lineRule="auto"/>
+        <w:ind w:left="1440"/>
+        <w:rPr>
+          <w:rFonts w:ascii="Times New Roman" w:hAnsi="Times New Roman" w:cs="Times New Roman"/>
+        </w:rPr>
+      </w:pPr>
+    </w:p>
+    <w:p>
+      <w:pPr>
+        <w:pStyle w:val="Heading5"/>
+      </w:pPr>
+      <w:r>
+        <w:t xml:space="preserve">3.2.5.1.3 </w:t>
+      </w:r>
+      <w:r>
+        <w:rPr>
+          <w:rStyle w:val="Toggle"/>
+        </w:rPr>
+        <w:t>[YES NH]</w:t>
+      </w:r>
+      <w:r>
+        <w:rPr>
+          <w:color w:val="FF0000"/>
+        </w:rPr>
+        <w:t xml:space="preserve"> </w:t>
+      </w:r>
+      <w:r>
+        <w:t xml:space="preserve">‘Need Heat’ Request </w:t>
+      </w:r>
+    </w:p>
+    <w:p>
+      <w:pPr>
+        <w:spacing w:after="0" w:line="240" w:lineRule="auto"/>
+        <w:ind w:left="1440"/>
+        <w:rPr>
+          <w:rFonts w:ascii="Times New Roman" w:hAnsi="Times New Roman" w:cs="Times New Roman"/>
+        </w:rPr>
+      </w:pPr>
     </w:p>
     <w:p>
       <w:pPr>
@@ -1820,92 +1833,27 @@
           <w:rFonts w:ascii="Times New Roman" w:hAnsi="Times New Roman" w:cs="Times New Roman"/>
         </w:rPr>
       </w:pPr>
-    </w:p>
-    <w:p>
-      <w:pPr>
-        <w:spacing w:after="0" w:line="240" w:lineRule="auto"/>
-        <w:ind w:left="2160"/>
-        <w:rPr>
-          <w:rFonts w:ascii="Times New Roman" w:hAnsi="Times New Roman" w:cs="Times New Roman"/>
-        </w:rPr>
-      </w:pPr>
-      <w:r>
-        <w:rPr>
-          <w:rFonts w:ascii="Times New Roman" w:hAnsi="Times New Roman" w:cs="Times New Roman"/>
-        </w:rPr>
-        <w:t>Occupied heating setpoint is equal to the occupied setpoint minus [5</w:t>
-      </w:r>
-      <w:r>
-        <w:rPr>
-          <w:rFonts w:ascii="Times New Roman" w:hAnsi="Times New Roman" w:cs="Times New Roman"/>
-        </w:rPr>
-        <w:t>°F</w:t>
-      </w:r>
-      <w:r>
-        <w:rPr>
-          <w:rFonts w:ascii="Times New Roman" w:hAnsi="Times New Roman" w:cs="Times New Roman"/>
-        </w:rPr>
-        <w:t xml:space="preserve">][___][as shown on the Point Schedule] (adj.) for heating. </w:t>
-      </w:r>
-    </w:p>
-    <w:p>
-      <w:pPr>
-        <w:spacing w:after="0" w:line="240" w:lineRule="auto"/>
-        <w:ind w:left="2160"/>
-        <w:rPr>
-          <w:rFonts w:ascii="Times New Roman" w:hAnsi="Times New Roman" w:cs="Times New Roman"/>
-        </w:rPr>
-      </w:pPr>
-    </w:p>
-    <w:p>
-      <w:pPr>
-        <w:spacing w:after="0" w:line="240" w:lineRule="auto"/>
-        <w:ind w:left="2160"/>
-        <w:rPr>
-          <w:rFonts w:ascii="Times New Roman" w:hAnsi="Times New Roman" w:cs="Times New Roman"/>
-        </w:rPr>
-      </w:pPr>
-      <w:r>
-        <w:rPr>
-          <w:rFonts w:ascii="Times New Roman" w:hAnsi="Times New Roman" w:cs="Times New Roman"/>
-        </w:rPr>
-        <w:t>Occupied cooling setpoint is equal to the occupied setpoint plus [5</w:t>
-      </w:r>
-      <w:r>
-        <w:rPr>
-          <w:rFonts w:ascii="Times New Roman" w:hAnsi="Times New Roman" w:cs="Times New Roman"/>
-        </w:rPr>
-        <w:t>°F</w:t>
-      </w:r>
-      <w:r>
-        <w:rPr>
-          <w:rFonts w:ascii="Times New Roman" w:hAnsi="Times New Roman" w:cs="Times New Roman"/>
-        </w:rPr>
-        <w:t xml:space="preserve">][___][as shown on the Point Schedule] (adj.) for cooling. </w:t>
-      </w:r>
-    </w:p>
-    <w:p>
-      <w:pPr>
-        <w:spacing w:after="0" w:line="240" w:lineRule="auto"/>
-        <w:ind w:left="2160"/>
-        <w:rPr>
-          <w:rFonts w:ascii="Times New Roman" w:hAnsi="Times New Roman" w:cs="Times New Roman"/>
-        </w:rPr>
-      </w:pPr>
-    </w:p>
-    <w:p>
-      <w:pPr>
-        <w:spacing w:after="0" w:line="240" w:lineRule="auto"/>
-        <w:ind w:left="2160"/>
-        <w:rPr>
-          <w:rFonts w:ascii="Times New Roman" w:hAnsi="Times New Roman" w:cs="Times New Roman"/>
-        </w:rPr>
-      </w:pPr>
-      <w:r>
-        <w:rPr>
-          <w:rFonts w:ascii="Times New Roman" w:hAnsi="Times New Roman" w:cs="Times New Roman"/>
-        </w:rPr>
-        <w:t xml:space="preserve">Enable cooling mode whenever the zone temperature is above the effective cooling setpoint. Enable heating mode whenever the zone temperature is below the effective heating setpoint. </w:t>
+      <w:r>
+        <w:rPr>
+          <w:rFonts w:ascii="Times New Roman" w:hAnsi="Times New Roman" w:cs="Times New Roman"/>
+        </w:rPr>
+        <w:t xml:space="preserve">If zone temperature is above the effective heating setpoint, send a ‘need heat’ request. </w:t>
+      </w:r>
+    </w:p>
+    <w:p>
+      <w:pPr>
+        <w:spacing w:after="0" w:line="240" w:lineRule="auto"/>
+        <w:rPr>
+          <w:rFonts w:ascii="Times New Roman" w:hAnsi="Times New Roman" w:cs="Times New Roman"/>
+        </w:rPr>
+      </w:pPr>
+    </w:p>
+    <w:p>
+      <w:pPr>
+        <w:pStyle w:val="Heading4"/>
+      </w:pPr>
+      <w:r>
+        <w:t xml:space="preserve">3.2.5.2 Zone Airflow Control </w:t>
       </w:r>
     </w:p>
     <w:p>
@@ -1919,173 +1867,9 @@
     </w:p>
     <w:p>
       <w:pPr>
-        <w:spacing w:after="0" w:line="240" w:lineRule="auto"/>
-        <w:ind w:left="1440"/>
-        <w:rPr>
-          <w:rFonts w:ascii="Times New Roman" w:hAnsi="Times New Roman" w:cs="Times New Roman"/>
-        </w:rPr>
-      </w:pPr>
-      <w:r>
-        <w:rPr>
-          <w:rFonts w:ascii="Times New Roman" w:hAnsi="Times New Roman" w:cs="Times New Roman"/>
-        </w:rPr>
-        <w:t xml:space="preserve">3.2.5.1.2 </w:t>
-      </w:r>
-      <w:r>
-        <w:rPr>
-          <w:rStyle w:val="Toggle"/>
-        </w:rPr>
-        <w:t>[YES NC]</w:t>
-      </w:r>
-      <w:r>
-        <w:rPr>
-          <w:rFonts w:ascii="Times New Roman" w:hAnsi="Times New Roman" w:cs="Times New Roman"/>
-          <w:color w:val="FF0000"/>
-        </w:rPr>
-        <w:t xml:space="preserve"> </w:t>
-      </w:r>
-      <w:r>
-        <w:rPr>
-          <w:rFonts w:ascii="Times New Roman" w:hAnsi="Times New Roman" w:cs="Times New Roman"/>
-        </w:rPr>
-        <w:t xml:space="preserve">‘Need Cool’ Request </w:t>
-      </w:r>
-    </w:p>
-    <w:p>
-      <w:pPr>
-        <w:spacing w:after="0" w:line="240" w:lineRule="auto"/>
-        <w:ind w:left="1440"/>
-        <w:rPr>
-          <w:rFonts w:ascii="Times New Roman" w:hAnsi="Times New Roman" w:cs="Times New Roman"/>
-        </w:rPr>
-      </w:pPr>
-    </w:p>
-    <w:p>
-      <w:pPr>
-        <w:spacing w:after="0" w:line="240" w:lineRule="auto"/>
-        <w:ind w:left="2160"/>
-        <w:rPr>
-          <w:rFonts w:ascii="Times New Roman" w:hAnsi="Times New Roman" w:cs="Times New Roman"/>
-        </w:rPr>
-      </w:pPr>
-      <w:r>
-        <w:rPr>
-          <w:rFonts w:ascii="Times New Roman" w:hAnsi="Times New Roman" w:cs="Times New Roman"/>
-        </w:rPr>
-        <w:t xml:space="preserve">If zone temperature is above the effective cooling setpoint, send a ‘need cool’ request. </w:t>
-      </w:r>
-    </w:p>
-    <w:p>
-      <w:pPr>
-        <w:spacing w:after="0" w:line="240" w:lineRule="auto"/>
-        <w:ind w:left="1440"/>
-        <w:rPr>
-          <w:rFonts w:ascii="Times New Roman" w:hAnsi="Times New Roman" w:cs="Times New Roman"/>
-        </w:rPr>
-      </w:pPr>
-    </w:p>
-    <w:p>
-      <w:pPr>
-        <w:spacing w:after="0" w:line="240" w:lineRule="auto"/>
-        <w:ind w:left="1440"/>
-        <w:rPr>
-          <w:rFonts w:ascii="Times New Roman" w:hAnsi="Times New Roman" w:cs="Times New Roman"/>
-        </w:rPr>
-      </w:pPr>
-      <w:r>
-        <w:rPr>
-          <w:rFonts w:ascii="Times New Roman" w:hAnsi="Times New Roman" w:cs="Times New Roman"/>
-        </w:rPr>
-        <w:t xml:space="preserve">3.2.5.1.3 </w:t>
-      </w:r>
-      <w:r>
-        <w:rPr>
-          <w:rStyle w:val="Toggle"/>
-        </w:rPr>
-        <w:t>[YES NH]</w:t>
-      </w:r>
-      <w:r>
-        <w:rPr>
-          <w:rFonts w:ascii="Times New Roman" w:hAnsi="Times New Roman" w:cs="Times New Roman"/>
-          <w:color w:val="FF0000"/>
-        </w:rPr>
-        <w:t xml:space="preserve"> </w:t>
-      </w:r>
-      <w:r>
-        <w:rPr>
-          <w:rFonts w:ascii="Times New Roman" w:hAnsi="Times New Roman" w:cs="Times New Roman"/>
-        </w:rPr>
-        <w:t xml:space="preserve">‘Need Heat’ Request </w:t>
-      </w:r>
-    </w:p>
-    <w:p>
-      <w:pPr>
-        <w:spacing w:after="0" w:line="240" w:lineRule="auto"/>
-        <w:ind w:left="1440"/>
-        <w:rPr>
-          <w:rFonts w:ascii="Times New Roman" w:hAnsi="Times New Roman" w:cs="Times New Roman"/>
-        </w:rPr>
-      </w:pPr>
-    </w:p>
-    <w:p>
-      <w:pPr>
-        <w:spacing w:after="0" w:line="240" w:lineRule="auto"/>
-        <w:ind w:left="2160"/>
-        <w:rPr>
-          <w:rFonts w:ascii="Times New Roman" w:hAnsi="Times New Roman" w:cs="Times New Roman"/>
-        </w:rPr>
-      </w:pPr>
-      <w:r>
-        <w:rPr>
-          <w:rFonts w:ascii="Times New Roman" w:hAnsi="Times New Roman" w:cs="Times New Roman"/>
-        </w:rPr>
-        <w:t xml:space="preserve">If zone temperature is above the effective heating setpoint, send a ‘need heat’ request. </w:t>
-      </w:r>
-    </w:p>
-    <w:p>
-      <w:pPr>
-        <w:spacing w:after="0" w:line="240" w:lineRule="auto"/>
-        <w:rPr>
-          <w:rFonts w:ascii="Times New Roman" w:hAnsi="Times New Roman" w:cs="Times New Roman"/>
-        </w:rPr>
-      </w:pPr>
-    </w:p>
-    <w:p>
-      <w:pPr>
-        <w:spacing w:after="0" w:line="240" w:lineRule="auto"/>
-        <w:ind w:left="720"/>
-        <w:rPr>
-          <w:rFonts w:ascii="Times New Roman" w:hAnsi="Times New Roman" w:cs="Times New Roman"/>
-        </w:rPr>
-      </w:pPr>
-      <w:r>
-        <w:rPr>
-          <w:rFonts w:ascii="Times New Roman" w:hAnsi="Times New Roman" w:cs="Times New Roman"/>
-        </w:rPr>
-        <w:t xml:space="preserve">3.2.5.2 Zone Airflow Control </w:t>
-      </w:r>
-    </w:p>
-    <w:p>
-      <w:pPr>
-        <w:spacing w:after="0" w:line="240" w:lineRule="auto"/>
-        <w:ind w:left="720"/>
-        <w:rPr>
-          <w:rFonts w:ascii="Times New Roman" w:hAnsi="Times New Roman" w:cs="Times New Roman"/>
-        </w:rPr>
-      </w:pPr>
-    </w:p>
-    <w:p>
-      <w:pPr>
-        <w:spacing w:after="0" w:line="240" w:lineRule="auto"/>
-        <w:ind w:left="1440"/>
-        <w:rPr>
-          <w:rFonts w:ascii="Times New Roman" w:hAnsi="Times New Roman" w:cs="Times New Roman"/>
-        </w:rPr>
-      </w:pPr>
-      <w:r>
-        <w:rPr>
-          <w:rFonts w:ascii="Times New Roman" w:hAnsi="Times New Roman" w:cs="Times New Roman"/>
-        </w:rPr>
+        <w:pStyle w:val="Heading5"/>
+      </w:pPr>
+      <w:r>
         <w:t xml:space="preserve">3.2.5.2.1 Airflow Setpoint </w:t>
       </w:r>
     </w:p>
@@ -2161,27 +1945,20 @@
     </w:p>
     <w:p>
       <w:pPr>
+        <w:pStyle w:val="Heading5"/>
+      </w:pPr>
+      <w:r>
+        <w:t xml:space="preserve">3.2.5.2.2 Primary Air Damper </w:t>
+      </w:r>
+    </w:p>
+    <w:p>
+      <w:pPr>
         <w:spacing w:after="0" w:line="240" w:lineRule="auto"/>
         <w:ind w:left="1440"/>
         <w:rPr>
           <w:rFonts w:ascii="Times New Roman" w:hAnsi="Times New Roman" w:cs="Times New Roman"/>
         </w:rPr>
       </w:pPr>
-      <w:r>
-        <w:rPr>
-          <w:rFonts w:ascii="Times New Roman" w:hAnsi="Times New Roman" w:cs="Times New Roman"/>
-        </w:rPr>
-        <w:t xml:space="preserve">3.2.5.2.2 Primary Air Damper </w:t>
-      </w:r>
-    </w:p>
-    <w:p>
-      <w:pPr>
-        <w:spacing w:after="0" w:line="240" w:lineRule="auto"/>
-        <w:ind w:left="1440"/>
-        <w:rPr>
-          <w:rFonts w:ascii="Times New Roman" w:hAnsi="Times New Roman" w:cs="Times New Roman"/>
-        </w:rPr>
-      </w:pPr>
     </w:p>
     <w:p>
       <w:pPr>
@@ -2209,24 +1986,16 @@
     </w:p>
     <w:p>
       <w:pPr>
-        <w:spacing w:after="0" w:line="240" w:lineRule="auto"/>
-        <w:ind w:left="1440"/>
-        <w:rPr>
-          <w:rFonts w:ascii="Times New Roman" w:hAnsi="Times New Roman" w:cs="Times New Roman"/>
-        </w:rPr>
+        <w:pStyle w:val="Heading5"/>
       </w:pPr>
       <w:commentRangeStart w:id="2"/>
       <w:r>
-        <w:rPr>
-          <w:rFonts w:ascii="Times New Roman" w:hAnsi="Times New Roman" w:cs="Times New Roman"/>
-        </w:rPr>
         <w:t xml:space="preserve">3.2.5.2.3 Cool Mode </w:t>
       </w:r>
       <w:commentRangeEnd w:id="2"/>
       <w:r>
         <w:rPr>
           <w:rStyle w:val="CommentReference"/>
-          <w:rFonts w:ascii="Times New Roman" w:hAnsi="Times New Roman" w:cs="Times New Roman"/>
           <w:sz w:val="24"/>
           <w:szCs w:val="24"/>
         </w:rPr>
@@ -2292,29 +2061,50 @@
     </w:p>
     <w:p>
       <w:pPr>
+        <w:pStyle w:val="Heading5"/>
+      </w:pPr>
+      <w:r>
+        <w:t xml:space="preserve">3.2.5.2.4 Heat Mode </w:t>
+      </w:r>
+    </w:p>
+    <w:p>
+      <w:pPr>
         <w:spacing w:after="0" w:line="240" w:lineRule="auto"/>
         <w:ind w:left="1440"/>
         <w:rPr>
           <w:rFonts w:ascii="Times New Roman" w:hAnsi="Times New Roman" w:cs="Times New Roman"/>
         </w:rPr>
       </w:pPr>
-      <w:r>
-        <w:rPr>
-          <w:rFonts w:ascii="Times New Roman" w:hAnsi="Times New Roman" w:cs="Times New Roman"/>
-        </w:rPr>
-        <w:t>3.2.</w:t>
-      </w:r>
-      <w:r>
-        <w:rPr>
-          <w:rFonts w:ascii="Times New Roman" w:hAnsi="Times New Roman" w:cs="Times New Roman"/>
-        </w:rPr>
-        <w:t>5</w:t>
-      </w:r>
-      <w:r>
-        <w:rPr>
-          <w:rFonts w:ascii="Times New Roman" w:hAnsi="Times New Roman" w:cs="Times New Roman"/>
-        </w:rPr>
-        <w:t xml:space="preserve">.2.4 Heat Mode </w:t>
+    </w:p>
+    <w:p>
+      <w:pPr>
+        <w:spacing w:after="0" w:line="240" w:lineRule="auto"/>
+        <w:ind w:left="2160"/>
+        <w:rPr>
+          <w:rFonts w:ascii="Times New Roman" w:hAnsi="Times New Roman" w:cs="Times New Roman"/>
+        </w:rPr>
+      </w:pPr>
+      <w:r>
+        <w:rPr>
+          <w:rFonts w:ascii="Times New Roman" w:hAnsi="Times New Roman" w:cs="Times New Roman"/>
+        </w:rPr>
+        <w:t xml:space="preserve">Maintain the primary airflow setpoint at the minimum flow limit. Reset the effective primary airflow setpoint towards the maximum limit whenever the heating is at maximum and zone temperature is still below the heating setpoint. When the heating mode is satisfied, reset the effective primary airflow setpoint towards the minimum limit. </w:t>
+      </w:r>
+    </w:p>
+    <w:p>
+      <w:pPr>
+        <w:spacing w:after="0" w:line="240" w:lineRule="auto"/>
+        <w:rPr>
+          <w:rFonts w:ascii="Times New Roman" w:hAnsi="Times New Roman" w:cs="Times New Roman"/>
+        </w:rPr>
+      </w:pPr>
+    </w:p>
+    <w:p>
+      <w:pPr>
+        <w:pStyle w:val="Heading4"/>
+      </w:pPr>
+      <w:r>
+        <w:t xml:space="preserve">3.2.5.3 Heating Control </w:t>
       </w:r>
     </w:p>
     <w:p>
@@ -2328,6 +2118,38 @@
     </w:p>
     <w:p>
       <w:pPr>
+        <w:pStyle w:val="Heading5"/>
+      </w:pPr>
+      <w:r>
+        <w:t xml:space="preserve">3.2.5.3.1 </w:t>
+      </w:r>
+      <w:r>
+        <w:rPr>
+          <w:rStyle w:val="Toggle"/>
+        </w:rPr>
+        <w:t>[EQUALS TERM_HT HW]</w:t>
+      </w:r>
+      <w:r>
+        <w:rPr>
+          <w:color w:val="FF0000"/>
+        </w:rPr>
+        <w:t xml:space="preserve"> </w:t>
+      </w:r>
+      <w:r>
+        <w:t xml:space="preserve">Hot Water Heating Coil </w:t>
+      </w:r>
+    </w:p>
+    <w:p>
+      <w:pPr>
+        <w:spacing w:after="0" w:line="240" w:lineRule="auto"/>
+        <w:ind w:left="1440"/>
+        <w:rPr>
+          <w:rFonts w:ascii="Times New Roman" w:hAnsi="Times New Roman" w:cs="Times New Roman"/>
+        </w:rPr>
+      </w:pPr>
+    </w:p>
+    <w:p>
+      <w:pPr>
         <w:spacing w:after="0" w:line="240" w:lineRule="auto"/>
         <w:ind w:left="2160"/>
         <w:rPr>
@@ -2338,16 +2160,80 @@
         <w:rPr>
           <w:rFonts w:ascii="Times New Roman" w:hAnsi="Times New Roman" w:cs="Times New Roman"/>
         </w:rPr>
-        <w:t xml:space="preserve">Maintain the primary airflow setpoint at the minimum flow limit. Reset the effective primary airflow setpoint towards the maximum limit whenever the heating is at maximum and zone temperature is still below the heating setpoint. When the heating mode is satisfied, reset the effective primary airflow setpoint towards the minimum limit. </w:t>
-      </w:r>
-    </w:p>
-    <w:p>
-      <w:pPr>
-        <w:spacing w:after="0" w:line="240" w:lineRule="auto"/>
-        <w:rPr>
-          <w:rFonts w:ascii="Times New Roman" w:hAnsi="Times New Roman" w:cs="Times New Roman"/>
-        </w:rPr>
-      </w:pPr>
+        <w:t xml:space="preserve">Modulate the heating hot water coil valve to maintain the zone temperature at the effective heating mode temperature setpoint whenever the zone is in heating mode. Otherwise, command the heating hot water valve closed. </w:t>
+      </w:r>
+    </w:p>
+    <w:p>
+      <w:pPr>
+        <w:spacing w:after="0" w:line="240" w:lineRule="auto"/>
+        <w:ind w:left="1440"/>
+        <w:rPr>
+          <w:rFonts w:ascii="Times New Roman" w:hAnsi="Times New Roman" w:cs="Times New Roman"/>
+        </w:rPr>
+      </w:pPr>
+    </w:p>
+    <w:p>
+      <w:pPr>
+        <w:pStyle w:val="Heading5"/>
+      </w:pPr>
+      <w:r>
+        <w:t xml:space="preserve">3.2.5.3.2 </w:t>
+      </w:r>
+      <w:r>
+        <w:rPr>
+          <w:rStyle w:val="Toggle"/>
+        </w:rPr>
+        <w:t>[EQUALS TERM_HT ELEC]</w:t>
+      </w:r>
+      <w:r>
+        <w:rPr>
+          <w:color w:val="FF0000"/>
+        </w:rPr>
+        <w:t xml:space="preserve"> </w:t>
+      </w:r>
+      <w:r>
+        <w:t xml:space="preserve">Electric Heat </w:t>
+      </w:r>
+    </w:p>
+    <w:p>
+      <w:pPr>
+        <w:spacing w:after="0" w:line="240" w:lineRule="auto"/>
+        <w:ind w:left="1440"/>
+        <w:rPr>
+          <w:rFonts w:ascii="Times New Roman" w:hAnsi="Times New Roman" w:cs="Times New Roman"/>
+        </w:rPr>
+      </w:pPr>
+    </w:p>
+    <w:p>
+      <w:pPr>
+        <w:spacing w:after="0" w:line="240" w:lineRule="auto"/>
+        <w:ind w:left="2160"/>
+        <w:rPr>
+          <w:rFonts w:ascii="Times New Roman" w:hAnsi="Times New Roman" w:cs="Times New Roman"/>
+        </w:rPr>
+      </w:pPr>
+      <w:r>
+        <w:rPr>
+          <w:rFonts w:ascii="Times New Roman" w:hAnsi="Times New Roman" w:cs="Times New Roman"/>
+        </w:rPr>
+        <w:t xml:space="preserve">Enable electric heat when airflow is proven, otherwise disable electric heat via hardware logic. Stage the electric heat to maintain the zone temperature at the effective heating mode temperature setpoint whenever the zone is in heating mode. Otherwise command the electric heat off. </w:t>
+      </w:r>
+    </w:p>
+    <w:p>
+      <w:pPr>
+        <w:spacing w:after="0" w:line="240" w:lineRule="auto"/>
+        <w:rPr>
+          <w:rFonts w:ascii="Times New Roman" w:hAnsi="Times New Roman" w:cs="Times New Roman"/>
+        </w:rPr>
+      </w:pPr>
+    </w:p>
+    <w:p>
+      <w:pPr>
+        <w:pStyle w:val="Heading4"/>
+      </w:pPr>
+      <w:r>
+        <w:t xml:space="preserve">3.2.5.4 Fan Control </w:t>
+      </w:r>
     </w:p>
     <w:p>
       <w:pPr>
@@ -2357,216 +2243,30 @@
           <w:rFonts w:ascii="Times New Roman" w:hAnsi="Times New Roman" w:cs="Times New Roman"/>
         </w:rPr>
       </w:pPr>
-      <w:r>
-        <w:rPr>
-          <w:rFonts w:ascii="Times New Roman" w:hAnsi="Times New Roman" w:cs="Times New Roman"/>
-        </w:rPr>
-        <w:t xml:space="preserve">3.2.5.3 Heating Control </w:t>
-      </w:r>
-    </w:p>
-    <w:p>
-      <w:pPr>
-        <w:spacing w:after="0" w:line="240" w:lineRule="auto"/>
-        <w:ind w:left="1440"/>
-        <w:rPr>
-          <w:rFonts w:ascii="Times New Roman" w:hAnsi="Times New Roman" w:cs="Times New Roman"/>
-        </w:rPr>
-      </w:pPr>
-    </w:p>
-    <w:p>
-      <w:pPr>
-        <w:spacing w:after="0" w:line="240" w:lineRule="auto"/>
-        <w:ind w:left="1440"/>
-        <w:rPr>
-          <w:rFonts w:ascii="Times New Roman" w:hAnsi="Times New Roman" w:cs="Times New Roman"/>
-        </w:rPr>
-      </w:pPr>
-      <w:r>
-        <w:rPr>
-          <w:rFonts w:ascii="Times New Roman" w:hAnsi="Times New Roman" w:cs="Times New Roman"/>
-        </w:rPr>
-        <w:t xml:space="preserve">3.2.5.3.1 </w:t>
+    </w:p>
+    <w:p>
+      <w:pPr>
+        <w:pStyle w:val="Heading5"/>
+      </w:pPr>
+      <w:r>
+        <w:t xml:space="preserve">3.2.5.4.1 </w:t>
       </w:r>
       <w:r>
         <w:rPr>
           <w:rStyle w:val="Toggle"/>
         </w:rPr>
-        <w:t>[EQUALS TERM_HT HW]</w:t>
-      </w:r>
-      <w:r>
-        <w:rPr>
-          <w:rFonts w:ascii="Times New Roman" w:hAnsi="Times New Roman" w:cs="Times New Roman"/>
+        <w:t>[EQUALS VAV SFBCV]</w:t>
+      </w:r>
+      <w:r>
+        <w:rPr>
           <w:color w:val="FF0000"/>
         </w:rPr>
         <w:t xml:space="preserve"> </w:t>
       </w:r>
       <w:r>
-        <w:rPr>
-          <w:rFonts w:ascii="Times New Roman" w:hAnsi="Times New Roman" w:cs="Times New Roman"/>
-        </w:rPr>
-        <w:t xml:space="preserve">Hot Water Heating Coil </w:t>
-      </w:r>
-    </w:p>
-    <w:p>
-      <w:pPr>
-        <w:spacing w:after="0" w:line="240" w:lineRule="auto"/>
-        <w:ind w:left="1440"/>
-        <w:rPr>
-          <w:rFonts w:ascii="Times New Roman" w:hAnsi="Times New Roman" w:cs="Times New Roman"/>
-        </w:rPr>
-      </w:pPr>
-    </w:p>
-    <w:p>
-      <w:pPr>
-        <w:spacing w:after="0" w:line="240" w:lineRule="auto"/>
-        <w:ind w:left="2160"/>
-        <w:rPr>
-          <w:rFonts w:ascii="Times New Roman" w:hAnsi="Times New Roman" w:cs="Times New Roman"/>
-        </w:rPr>
-      </w:pPr>
-      <w:r>
-        <w:rPr>
-          <w:rFonts w:ascii="Times New Roman" w:hAnsi="Times New Roman" w:cs="Times New Roman"/>
-        </w:rPr>
-        <w:t xml:space="preserve">Modulate the heating hot water coil valve to maintain the zone temperature at the effective heating mode temperature setpoint whenever the zone is in heating mode. Otherwise, command the heating hot water valve closed. </w:t>
-      </w:r>
-    </w:p>
-    <w:p>
-      <w:pPr>
-        <w:spacing w:after="0" w:line="240" w:lineRule="auto"/>
-        <w:ind w:left="1440"/>
-        <w:rPr>
-          <w:rFonts w:ascii="Times New Roman" w:hAnsi="Times New Roman" w:cs="Times New Roman"/>
-        </w:rPr>
-      </w:pPr>
-    </w:p>
-    <w:p>
-      <w:pPr>
-        <w:spacing w:after="0" w:line="240" w:lineRule="auto"/>
-        <w:ind w:left="1440"/>
-        <w:rPr>
-          <w:rFonts w:ascii="Times New Roman" w:hAnsi="Times New Roman" w:cs="Times New Roman"/>
-        </w:rPr>
-      </w:pPr>
-      <w:r>
-        <w:rPr>
-          <w:rFonts w:ascii="Times New Roman" w:hAnsi="Times New Roman" w:cs="Times New Roman"/>
-        </w:rPr>
-        <w:t xml:space="preserve">3.2.5.3.2 </w:t>
-      </w:r>
-      <w:r>
-        <w:rPr>
-          <w:rStyle w:val="Toggle"/>
-        </w:rPr>
-        <w:t>[EQUALS TERM_HT ELEC]</w:t>
-      </w:r>
-      <w:r>
-        <w:rPr>
-          <w:rFonts w:ascii="Times New Roman" w:hAnsi="Times New Roman" w:cs="Times New Roman"/>
-          <w:color w:val="FF0000"/>
-        </w:rPr>
-        <w:t xml:space="preserve"> </w:t>
-      </w:r>
-      <w:r>
-        <w:rPr>
-          <w:rFonts w:ascii="Times New Roman" w:hAnsi="Times New Roman" w:cs="Times New Roman"/>
-        </w:rPr>
-        <w:t xml:space="preserve">Electric Heat </w:t>
-      </w:r>
-    </w:p>
-    <w:p>
-      <w:pPr>
-        <w:spacing w:after="0" w:line="240" w:lineRule="auto"/>
-        <w:ind w:left="1440"/>
-        <w:rPr>
-          <w:rFonts w:ascii="Times New Roman" w:hAnsi="Times New Roman" w:cs="Times New Roman"/>
-        </w:rPr>
-      </w:pPr>
-    </w:p>
-    <w:p>
-      <w:pPr>
-        <w:spacing w:after="0" w:line="240" w:lineRule="auto"/>
-        <w:ind w:left="2160"/>
-        <w:rPr>
-          <w:rFonts w:ascii="Times New Roman" w:hAnsi="Times New Roman" w:cs="Times New Roman"/>
-        </w:rPr>
-      </w:pPr>
-      <w:r>
-        <w:rPr>
-          <w:rFonts w:ascii="Times New Roman" w:hAnsi="Times New Roman" w:cs="Times New Roman"/>
-        </w:rPr>
-        <w:t xml:space="preserve">Enable electric heat when airflow is proven, otherwise disable electric heat via hardware logic. Stage the electric heat to maintain the zone temperature at the effective heating mode temperature setpoint whenever the zone is in heating mode. Otherwise command the electric heat off. </w:t>
-      </w:r>
-    </w:p>
-    <w:p>
-      <w:pPr>
-        <w:spacing w:after="0" w:line="240" w:lineRule="auto"/>
-        <w:rPr>
-          <w:rFonts w:ascii="Times New Roman" w:hAnsi="Times New Roman" w:cs="Times New Roman"/>
-        </w:rPr>
-      </w:pPr>
-    </w:p>
-    <w:p>
-      <w:pPr>
-        <w:spacing w:after="0" w:line="240" w:lineRule="auto"/>
-        <w:ind w:left="720"/>
-        <w:rPr>
-          <w:rFonts w:ascii="Times New Roman" w:hAnsi="Times New Roman" w:cs="Times New Roman"/>
-        </w:rPr>
-      </w:pPr>
-      <w:r>
-        <w:rPr>
-          <w:rFonts w:ascii="Times New Roman" w:hAnsi="Times New Roman" w:cs="Times New Roman"/>
-        </w:rPr>
-        <w:t xml:space="preserve">3.2.5.4 Fan Control </w:t>
-      </w:r>
-    </w:p>
-    <w:p>
-      <w:pPr>
-        <w:spacing w:after="0" w:line="240" w:lineRule="auto"/>
-        <w:ind w:left="720"/>
-        <w:rPr>
-          <w:rFonts w:ascii="Times New Roman" w:hAnsi="Times New Roman" w:cs="Times New Roman"/>
-        </w:rPr>
-      </w:pPr>
-    </w:p>
-    <w:p>
-      <w:pPr>
-        <w:spacing w:after="0" w:line="240" w:lineRule="auto"/>
-        <w:ind w:left="1440"/>
-        <w:rPr>
-          <w:rFonts w:ascii="Times New Roman" w:hAnsi="Times New Roman" w:cs="Times New Roman"/>
-        </w:rPr>
-      </w:pPr>
-      <w:r>
-        <w:rPr>
-          <w:rFonts w:ascii="Times New Roman" w:hAnsi="Times New Roman" w:cs="Times New Roman"/>
-        </w:rPr>
-        <w:t xml:space="preserve">3.2.5.4.1 </w:t>
-      </w:r>
-      <w:r>
-        <w:rPr>
-          <w:rStyle w:val="Toggle"/>
-        </w:rPr>
-        <w:t>[EQUALS VAV SFBCV]</w:t>
-      </w:r>
-      <w:r>
-        <w:rPr>
-          <w:rFonts w:ascii="Times New Roman" w:hAnsi="Times New Roman" w:cs="Times New Roman"/>
-          <w:color w:val="FF0000"/>
-        </w:rPr>
-        <w:t xml:space="preserve"> </w:t>
-      </w:r>
-      <w:r>
-        <w:rPr>
-          <w:rFonts w:ascii="Times New Roman" w:hAnsi="Times New Roman" w:cs="Times New Roman"/>
-        </w:rPr>
         <w:t xml:space="preserve">Series </w:t>
       </w:r>
       <w:r>
-        <w:rPr>
-          <w:rFonts w:ascii="Times New Roman" w:hAnsi="Times New Roman" w:cs="Times New Roman"/>
-        </w:rPr>
         <w:t xml:space="preserve">Fan Start/Stop </w:t>
       </w:r>
     </w:p>
@@ -2605,36 +2305,49 @@
     </w:p>
     <w:p>
       <w:pPr>
+        <w:pStyle w:val="Heading5"/>
+      </w:pPr>
+      <w:r>
+        <w:t xml:space="preserve">3.2.5.4.2 </w:t>
+      </w:r>
+      <w:r>
+        <w:rPr>
+          <w:rStyle w:val="Toggle"/>
+        </w:rPr>
+        <w:t>[EQUALS VAV PFBCV]</w:t>
+      </w:r>
+      <w:r>
+        <w:rPr>
+          <w:color w:val="FF0000"/>
+        </w:rPr>
+        <w:t xml:space="preserve"> </w:t>
+      </w:r>
+      <w:r>
+        <w:t xml:space="preserve">Parallel Fan Start/Stop </w:t>
+      </w:r>
+    </w:p>
+    <w:p>
+      <w:pPr>
         <w:spacing w:after="0" w:line="240" w:lineRule="auto"/>
         <w:ind w:left="1440"/>
         <w:rPr>
           <w:rFonts w:ascii="Times New Roman" w:hAnsi="Times New Roman" w:cs="Times New Roman"/>
         </w:rPr>
       </w:pPr>
-      <w:r>
-        <w:rPr>
-          <w:rFonts w:ascii="Times New Roman" w:hAnsi="Times New Roman" w:cs="Times New Roman"/>
-        </w:rPr>
-        <w:t xml:space="preserve">3.2.5.4.2 </w:t>
-      </w:r>
-      <w:r>
-        <w:rPr>
-          <w:rStyle w:val="Toggle"/>
-        </w:rPr>
-        <w:t>[EQUALS VAV PFBCV]</w:t>
-      </w:r>
-      <w:r>
-        <w:rPr>
-          <w:rFonts w:ascii="Times New Roman" w:hAnsi="Times New Roman" w:cs="Times New Roman"/>
-          <w:color w:val="FF0000"/>
-        </w:rPr>
-        <w:t xml:space="preserve"> </w:t>
-      </w:r>
-      <w:r>
-        <w:rPr>
-          <w:rFonts w:ascii="Times New Roman" w:hAnsi="Times New Roman" w:cs="Times New Roman"/>
-        </w:rPr>
-        <w:t xml:space="preserve">Parallel Fan Start/Stop </w:t>
+    </w:p>
+    <w:p>
+      <w:pPr>
+        <w:spacing w:after="0" w:line="240" w:lineRule="auto"/>
+        <w:ind w:left="2160"/>
+        <w:rPr>
+          <w:rFonts w:ascii="Times New Roman" w:hAnsi="Times New Roman" w:cs="Times New Roman"/>
+        </w:rPr>
+      </w:pPr>
+      <w:r>
+        <w:rPr>
+          <w:rFonts w:ascii="Times New Roman" w:hAnsi="Times New Roman" w:cs="Times New Roman"/>
+        </w:rPr>
+        <w:t xml:space="preserve">Command the fan to run whenever the zone is in heating mode. Command the fan off when the zone temperature is above the unoccupied heating setpoint. </w:t>
       </w:r>
     </w:p>
     <w:p>
@@ -2648,52 +2361,15 @@
     </w:p>
     <w:p>
       <w:pPr>
-        <w:spacing w:after="0" w:line="240" w:lineRule="auto"/>
-        <w:ind w:left="2160"/>
-        <w:rPr>
-          <w:rFonts w:ascii="Times New Roman" w:hAnsi="Times New Roman" w:cs="Times New Roman"/>
-        </w:rPr>
-      </w:pPr>
-      <w:r>
-        <w:rPr>
-          <w:rFonts w:ascii="Times New Roman" w:hAnsi="Times New Roman" w:cs="Times New Roman"/>
-        </w:rPr>
-        <w:t xml:space="preserve">Command the fan to run whenever the zone is in heating mode. Command the fan off when the zone temperature is above the unoccupied heating setpoint. </w:t>
-      </w:r>
-    </w:p>
-    <w:p>
-      <w:pPr>
-        <w:spacing w:after="0" w:line="240" w:lineRule="auto"/>
-        <w:ind w:left="1440"/>
-        <w:rPr>
-          <w:rFonts w:ascii="Times New Roman" w:hAnsi="Times New Roman" w:cs="Times New Roman"/>
-        </w:rPr>
-      </w:pPr>
-    </w:p>
-    <w:p>
-      <w:pPr>
-        <w:spacing w:after="0" w:line="240" w:lineRule="auto"/>
-        <w:ind w:left="1440"/>
-        <w:rPr>
-          <w:rFonts w:ascii="Times New Roman" w:hAnsi="Times New Roman" w:cs="Times New Roman"/>
-        </w:rPr>
-      </w:pPr>
-      <w:r>
-        <w:rPr>
-          <w:rFonts w:ascii="Times New Roman" w:hAnsi="Times New Roman" w:cs="Times New Roman"/>
-        </w:rPr>
+        <w:pStyle w:val="Heading5"/>
+      </w:pPr>
+      <w:r>
         <w:t>3.2.5.4.</w:t>
       </w:r>
       <w:r>
-        <w:rPr>
-          <w:rFonts w:ascii="Times New Roman" w:hAnsi="Times New Roman" w:cs="Times New Roman"/>
-        </w:rPr>
         <w:t>3</w:t>
       </w:r>
       <w:r>
-        <w:rPr>
-          <w:rFonts w:ascii="Times New Roman" w:hAnsi="Times New Roman" w:cs="Times New Roman"/>
-        </w:rPr>
         <w:t xml:space="preserve"> Proof </w:t>
       </w:r>
     </w:p>
@@ -2749,8 +2425,8 @@
         <w:tblLook w:val="04A0" w:firstRow="1" w:lastRow="0" w:firstColumn="1" w:lastColumn="0" w:noHBand="0" w:noVBand="1"/>
       </w:tblPr>
       <w:tblGrid>
-        <w:gridCol w:w="4665"/>
-        <w:gridCol w:w="4665"/>
+        <w:gridCol w:w="4664"/>
+        <w:gridCol w:w="4666"/>
       </w:tblGrid>
       <w:tr>
         <w:tc>
@@ -4512,21 +4188,15 @@
     <w:next w:val="Normal"/>
     <w:link w:val="Heading3Char"/>
     <w:uiPriority w:val="9"/>
-    <w:semiHidden/>
     <w:unhideWhenUsed/>
     <w:qFormat/>
-    <w:rsid w:val="006F3800"/>
+    <w:rsid w:val="008150E3"/>
     <w:pPr>
-      <w:keepNext/>
-      <w:keepLines/>
-      <w:spacing w:before="160" w:after="80"/>
+      <w:spacing w:after="0" w:line="240" w:lineRule="auto"/>
       <w:outlineLvl w:val="2"/>
     </w:pPr>
     <w:rPr>
-      <w:rFonts w:eastAsiaTheme="majorEastAsia" w:cstheme="majorBidi"/>
-      <w:color w:val="0F4761" w:themeColor="accent1" w:themeShade="BF"/>
-      <w:sz w:val="28"/>
-      <w:szCs w:val="28"/>
+      <w:rFonts w:ascii="Times New Roman" w:hAnsi="Times New Roman" w:cs="Times New Roman"/>
     </w:rPr>
   </w:style>
   <w:style w:type="paragraph" w:styleId="Heading4">
@@ -4535,21 +4205,16 @@
     <w:next w:val="Normal"/>
     <w:link w:val="Heading4Char"/>
     <w:uiPriority w:val="9"/>
-    <w:semiHidden/>
     <w:unhideWhenUsed/>
     <w:qFormat/>
-    <w:rsid w:val="006F3800"/>
+    <w:rsid w:val="008150E3"/>
     <w:pPr>
-      <w:keepNext/>
-      <w:keepLines/>
-      <w:spacing w:before="80" w:after="40"/>
+      <w:spacing w:after="0" w:line="240" w:lineRule="auto"/>
+      <w:ind w:left="720"/>
       <w:outlineLvl w:val="3"/>
     </w:pPr>
     <w:rPr>
-      <w:rFonts w:eastAsiaTheme="majorEastAsia" w:cstheme="majorBidi"/>
-      <w:i/>
-      <w:iCs/>
-      <w:color w:val="0F4761" w:themeColor="accent1" w:themeShade="BF"/>
+      <w:rFonts w:ascii="Times New Roman" w:hAnsi="Times New Roman" w:cs="Times New Roman"/>
     </w:rPr>
   </w:style>
   <w:style w:type="paragraph" w:styleId="Heading5">
@@ -4558,19 +4223,16 @@
     <w:next w:val="Normal"/>
     <w:link w:val="Heading5Char"/>
     <w:uiPriority w:val="9"/>
-    <w:semiHidden/>
     <w:unhideWhenUsed/>
     <w:qFormat/>
-    <w:rsid w:val="006F3800"/>
+    <w:rsid w:val="008150E3"/>
     <w:pPr>
-      <w:keepNext/>
-      <w:keepLines/>
-      <w:spacing w:before="80" w:after="40"/>
+      <w:spacing w:after="0" w:line="240" w:lineRule="auto"/>
+      <w:ind w:left="1440"/>
       <w:outlineLvl w:val="4"/>
     </w:pPr>
     <w:rPr>
-      <w:rFonts w:eastAsiaTheme="majorEastAsia" w:cstheme="majorBidi"/>
-      <w:color w:val="0F4761" w:themeColor="accent1" w:themeShade="BF"/>
+      <w:rFonts w:ascii="Times New Roman" w:hAnsi="Times New Roman" w:cs="Times New Roman"/>
     </w:rPr>
   </w:style>
   <w:style w:type="paragraph" w:styleId="Heading6">
@@ -4720,13 +4382,9 @@
     <w:basedOn w:val="DefaultParagraphFont"/>
     <w:link w:val="Heading3"/>
     <w:uiPriority w:val="9"/>
-    <w:semiHidden/>
-    <w:rsid w:val="006F3800"/>
+    <w:rsid w:val="008150E3"/>
     <w:rPr>
-      <w:rFonts w:eastAsiaTheme="majorEastAsia" w:cstheme="majorBidi"/>
-      <w:color w:val="0F4761" w:themeColor="accent1" w:themeShade="BF"/>
-      <w:sz w:val="28"/>
-      <w:szCs w:val="28"/>
+      <w:rFonts w:ascii="Times New Roman" w:hAnsi="Times New Roman" w:cs="Times New Roman"/>
     </w:rPr>
   </w:style>
   <w:style w:type="character" w:customStyle="1" w:styleId="Heading4Char">
@@ -4734,13 +4392,9 @@
     <w:basedOn w:val="DefaultParagraphFont"/>
     <w:link w:val="Heading4"/>
     <w:uiPriority w:val="9"/>
-    <w:semiHidden/>
-    <w:rsid w:val="006F3800"/>
+    <w:rsid w:val="008150E3"/>
     <w:rPr>
-      <w:rFonts w:eastAsiaTheme="majorEastAsia" w:cstheme="majorBidi"/>
-      <w:i/>
-      <w:iCs/>
-      <w:color w:val="0F4761" w:themeColor="accent1" w:themeShade="BF"/>
+      <w:rFonts w:ascii="Times New Roman" w:hAnsi="Times New Roman" w:cs="Times New Roman"/>
     </w:rPr>
   </w:style>
   <w:style w:type="character" w:customStyle="1" w:styleId="Heading5Char">
@@ -4748,11 +4402,9 @@
     <w:basedOn w:val="DefaultParagraphFont"/>
     <w:link w:val="Heading5"/>
     <w:uiPriority w:val="9"/>
-    <w:semiHidden/>
-    <w:rsid w:val="006F3800"/>
+    <w:rsid w:val="008150E3"/>
     <w:rPr>
-      <w:rFonts w:eastAsiaTheme="majorEastAsia" w:cstheme="majorBidi"/>
-      <w:color w:val="0F4761" w:themeColor="accent1" w:themeShade="BF"/>
+      <w:rFonts w:ascii="Times New Roman" w:hAnsi="Times New Roman" w:cs="Times New Roman"/>
     </w:rPr>
   </w:style>
   <w:style w:type="character" w:customStyle="1" w:styleId="Heading6Char">
@@ -5382,25 +5034,10 @@
 </file>
 
 <file path=customXml/item1.xml><?xml version="1.0" encoding="utf-8"?>
-<p:properties xmlns:p="http://schemas.microsoft.com/office/2006/metadata/properties" xmlns:xsi="http://www.w3.org/2001/XMLSchema-instance" xmlns:pc="http://schemas.microsoft.com/office/infopath/2007/PartnerControls">
-  <documentManagement>
-    <lcf76f155ced4ddcb4097134ff3c332f xmlns="c0e2252c-ade2-4076-8665-f43014c768d6">
-      <Terms xmlns="http://schemas.microsoft.com/office/infopath/2007/PartnerControls"/>
-    </lcf76f155ced4ddcb4097134ff3c332f>
-  </documentManagement>
-</p:properties>
+<b:Sources xmlns:b="http://schemas.openxmlformats.org/officeDocument/2006/bibliography" xmlns="http://schemas.openxmlformats.org/officeDocument/2006/bibliography" SelectedStyle="/IEEE2006OfficeOnline.xsl" StyleName="IEEE" Version="2006"/>
 </file>
 
 <file path=customXml/item2.xml><?xml version="1.0" encoding="utf-8"?>
-<?mso-contentType ?>
-<FormTemplates xmlns="http://schemas.microsoft.com/sharepoint/v3/contenttype/forms">
-  <Display>DocumentLibraryForm</Display>
-  <Edit>DocumentLibraryForm</Edit>
-  <New>DocumentLibraryForm</New>
-</FormTemplates>
-</file>
-
-<file path=customXml/item3.xml><?xml version="1.0" encoding="utf-8"?>
 <ct:contentTypeSchema xmlns:ct="http://schemas.microsoft.com/office/2006/metadata/contentType" xmlns:ma="http://schemas.microsoft.com/office/2006/metadata/properties/metaAttributes" ct:_="" ma:_="" ma:contentTypeName="Document" ma:contentTypeID="0x0101003E002026435D7B4FA0EA54BD348B0723" ma:contentTypeVersion="11" ma:contentTypeDescription="Create a new document." ma:contentTypeScope="" ma:versionID="40ef61dd0fb81d80a2746905629c8c23">
   <xsd:schema xmlns:xsd="http://www.w3.org/2001/XMLSchema" xmlns:xs="http://www.w3.org/2001/XMLSchema" xmlns:p="http://schemas.microsoft.com/office/2006/metadata/properties" xmlns:ns2="c0e2252c-ade2-4076-8665-f43014c768d6" targetNamespace="http://schemas.microsoft.com/office/2006/metadata/properties" ma:root="true" ma:fieldsID="763e62356df67bb6e2c7fa8cd509bbc0" ns2:_="">
     <xsd:import namespace="c0e2252c-ade2-4076-8665-f43014c768d6"/>
@@ -5584,29 +5221,34 @@
 </ct:contentTypeSchema>
 </file>
 
+<file path=customXml/item3.xml><?xml version="1.0" encoding="utf-8"?>
+<?mso-contentType ?>
+<FormTemplates xmlns="http://schemas.microsoft.com/sharepoint/v3/contenttype/forms">
+  <Display>DocumentLibraryForm</Display>
+  <Edit>DocumentLibraryForm</Edit>
+  <New>DocumentLibraryForm</New>
+</FormTemplates>
+</file>
+
 <file path=customXml/item4.xml><?xml version="1.0" encoding="utf-8"?>
-<b:Sources xmlns:b="http://schemas.openxmlformats.org/officeDocument/2006/bibliography" xmlns="http://schemas.openxmlformats.org/officeDocument/2006/bibliography" SelectedStyle="/IEEE2006OfficeOnline.xsl" StyleName="IEEE" Version="2006"/>
+<p:properties xmlns:p="http://schemas.microsoft.com/office/2006/metadata/properties" xmlns:xsi="http://www.w3.org/2001/XMLSchema-instance" xmlns:pc="http://schemas.microsoft.com/office/infopath/2007/PartnerControls">
+  <documentManagement>
+    <lcf76f155ced4ddcb4097134ff3c332f xmlns="c0e2252c-ade2-4076-8665-f43014c768d6">
+      <Terms xmlns="http://schemas.microsoft.com/office/infopath/2007/PartnerControls"/>
+    </lcf76f155ced4ddcb4097134ff3c332f>
+  </documentManagement>
+</p:properties>
 </file>
 
 <file path=customXml/itemProps1.xml><?xml version="1.0" encoding="utf-8"?>
-<ds:datastoreItem xmlns:ds="http://schemas.openxmlformats.org/officeDocument/2006/customXml" ds:itemID="{716A10E0-911A-440F-8315-5CC1259F6D55}">
+<ds:datastoreItem xmlns:ds="http://schemas.openxmlformats.org/officeDocument/2006/customXml" ds:itemID="{59846F35-00F8-ED48-9BB1-C883E4A0BC18}">
   <ds:schemaRefs>
-    <ds:schemaRef ds:uri="http://schemas.microsoft.com/office/2006/metadata/properties"/>
-    <ds:schemaRef ds:uri="http://schemas.microsoft.com/office/infopath/2007/PartnerControls"/>
-    <ds:schemaRef ds:uri="c0e2252c-ade2-4076-8665-f43014c768d6"/>
+    <ds:schemaRef ds:uri="http://schemas.openxmlformats.org/officeDocument/2006/bibliography"/>
   </ds:schemaRefs>
 </ds:datastoreItem>
 </file>
 
 <file path=customXml/itemProps2.xml><?xml version="1.0" encoding="utf-8"?>
-<ds:datastoreItem xmlns:ds="http://schemas.openxmlformats.org/officeDocument/2006/customXml" ds:itemID="{7CED3AA4-42AB-42F9-B8CA-303427F041B2}">
-  <ds:schemaRefs>
-    <ds:schemaRef ds:uri="http://schemas.microsoft.com/sharepoint/v3/contenttype/forms"/>
-  </ds:schemaRefs>
-</ds:datastoreItem>
-</file>
-
-<file path=customXml/itemProps3.xml><?xml version="1.0" encoding="utf-8"?>
 <ds:datastoreItem xmlns:ds="http://schemas.openxmlformats.org/officeDocument/2006/customXml" ds:itemID="{B5D45872-6CBD-4177-A939-ECB472357230}">
   <ds:schemaRefs>
     <ds:schemaRef ds:uri="http://schemas.microsoft.com/office/2006/metadata/contentType"/>
@@ -5624,10 +5266,20 @@
 </ds:datastoreItem>
 </file>
 
+<file path=customXml/itemProps3.xml><?xml version="1.0" encoding="utf-8"?>
+<ds:datastoreItem xmlns:ds="http://schemas.openxmlformats.org/officeDocument/2006/customXml" ds:itemID="{7CED3AA4-42AB-42F9-B8CA-303427F041B2}">
+  <ds:schemaRefs>
+    <ds:schemaRef ds:uri="http://schemas.microsoft.com/sharepoint/v3/contenttype/forms"/>
+  </ds:schemaRefs>
+</ds:datastoreItem>
+</file>
+
 <file path=customXml/itemProps4.xml><?xml version="1.0" encoding="utf-8"?>
-<ds:datastoreItem xmlns:ds="http://schemas.openxmlformats.org/officeDocument/2006/customXml" ds:itemID="{59846F35-00F8-ED48-9BB1-C883E4A0BC18}">
+<ds:datastoreItem xmlns:ds="http://schemas.openxmlformats.org/officeDocument/2006/customXml" ds:itemID="{716A10E0-911A-440F-8315-5CC1259F6D55}">
   <ds:schemaRefs>
-    <ds:schemaRef ds:uri="http://schemas.openxmlformats.org/officeDocument/2006/bibliography"/>
+    <ds:schemaRef ds:uri="http://schemas.microsoft.com/office/2006/metadata/properties"/>
+    <ds:schemaRef ds:uri="http://schemas.microsoft.com/office/infopath/2007/PartnerControls"/>
+    <ds:schemaRef ds:uri="c0e2252c-ade2-4076-8665-f43014c768d6"/>
   </ds:schemaRefs>
 </ds:datastoreItem>
 </file>

</xml_diff>